<commit_message>
Address second-round review with paired timing calibration and yellow-highlighted manuscript
</commit_message>
<xml_diff>
--- a/paper/icemce2026_iop_manuscript.docx
+++ b/paper/icemce2026_iop_manuscript.docx
@@ -59,7 +59,20 @@
         <w:rPr>
           <w:rFonts w:ascii="Times New Roman" w:hAnsi="Times New Roman" w:eastAsia="Times New Roman"/>
         </w:rPr>
-        <w:t>Abstract. Sparse solves for variable-coefficient heat conduction depend on coefficient geometry, forcing, preconditioner setup, and implementation. We present a verified finite-difference benchmark with an invariant-preserving audit of solver-choice claims. Smooth manufactured solutions recover second-order convergence and an aligned interface test verifies flux treatment. Beyond a baseline coefficient-family comparison, matched binary fields hold contrast, material fraction, total variation, and maximum log-gradient fixed. In a controlled N = 192, contrast-1000 case, translating the same two-island field by one grid point raises Jacobi-PCG iterations from 403 to 677 and reverses the setup-inclusive winner from Jacobi to AMG in all five repeats. Reflection-invariant Krylov subspaces explain why an odd source can avoid slow island modes; source perturbations and an independent motif family test this interpretation. An interleaved audit with classical AMG confirms that reversal locations depend on the candidate solver set. All 2956 controlled extension solves satisfy an independently checked relative residual below 1e-8. The resulting audit exposes limits of translation-invariant coefficient descriptors without proposing a new solver-selection algorithm. CPU/CUDA measurements separately quantify stencil scaling; GPU claims remain restricted to resident-data kernels. Raw CSV files, scripts, tests, and generated outputs support the numerical and performance claims.</w:t>
+        <w:t xml:space="preserve">Abstract. Sparse solves for variable-coefficient heat conduction depend on coefficient geometry, forcing, preconditioner setup, and implementation. We present a verified finite-difference benchmark with an invariant-preserving audit of solver-choice claims. Smooth manufactured solutions recover second-order convergence and an aligned interface test verifies flux treatment. Beyond a baseline coefficient-family comparison, matched binary fields hold contrast, material fraction, total variation, and maximum log-gradient fixed. In a controlled N = 192, contrast-1000 case, translating the same two-island field by one grid point raises Jacobi-PCG iterations from 403 to 677 and reverses the setup-inclusive winner from Jacobi to AMG in all five repeats. Reflection-invariant Krylov subspaces explain why an odd source can avoid slow island modes; source perturbations and an independent motif family test this interpretation. An interleaved audit with classical AMG confirms that reversal locations depend on the candidate solver set. All 2956 controlled extension solves satisfy an independently checked relative residual below 1e-8. The resulting audit exposes limits of translation-invariant coefficient descriptors without proposing a new solver-selection algorithm. </w:t>
+      </w:r>
+      <w:r>
+        <w:rPr>
+          <w:rFonts w:ascii="Times New Roman" w:hAnsi="Times New Roman" w:eastAsia="Times New Roman"/>
+          <w:highlight w:val="yellow"/>
+        </w:rPr>
+        <w:t xml:space="preserve">A separate paired callback calibration quantifies monitoring overhead without treating historical and controlled timings as interchangeable. </w:t>
+      </w:r>
+      <w:r>
+        <w:rPr>
+          <w:rFonts w:ascii="Times New Roman" w:hAnsi="Times New Roman" w:eastAsia="Times New Roman"/>
+        </w:rPr>
+        <w:t xml:space="preserve">CPU/CUDA measurements separately quantify stencil scaling; GPU claims remain restricted to resident-data kernels. Raw CSV files, scripts, tests, and generated outputs support the numerical and performance claims.</w:t>
       </w:r>
     </w:p>
     <w:p/>
@@ -1381,6 +1394,33 @@
       <w:r>
         <w:rPr>
           <w:rFonts w:ascii="Times New Roman" w:hAnsi="Times New Roman" w:eastAsia="Times New Roman"/>
+          <w:highlight w:val="yellow"/>
+        </w:rPr>
+        <w:t xml:space="preserve">Arithmetic faces are retained to preserve the specified nodal graph-diffusion benchmark and its historical comparisons, not because they are the preferred interface law for composite heat conduction. Interface conductivity is a standard numerical heat-transfer issue </w:t>
+      </w:r>
+      <w:r>
+        <w:rPr>
+          <w:rFonts w:ascii="Times New Roman" w:hAnsi="Times New Roman" w:eastAsia="Times New Roman"/>
+          <w:vertAlign w:val="superscript"/>
+          <w:highlight w:val="yellow"/>
+        </w:rPr>
+        <w:t xml:space="preserve">[26]</w:t>
+      </w:r>
+      <w:r>
+        <w:rPr>
+          <w:rFonts w:ascii="Times New Roman" w:hAnsi="Times New Roman" w:eastAsia="Times New Roman"/>
+          <w:highlight w:val="yellow"/>
+        </w:rPr>
+        <w:t xml:space="preserve">. For two half-links of equal length with conductivities a and b, continuity of flux gives the series resistance h/(2a) + h/(2b), hence kH = 2ab/(a + b), whereas kA = (a + b)/2. Their difference is (a - b)²/[2(a + b)]: it is O(h²) for smooth positive conductivity, but need not be small at a jump. At contrast c = 100, kA/kH = (c + 1)²/(4c) = 25.5025 on a mixed link. This is a local conductance ratio under the half-link interface assumption, not a global temperature-error estimate. Thus the arithmetic high-contrast results describe solver behaviour for that discrete operator; they do not validate composite-material heat flux. Harmonic averaging has the correct aligned series-resistance interpretation, while a curved interface requires additional geometric treatment. The matched-field audit includes both averages so that its conclusions are not restricted to arithmetic faces.</w:t>
+      </w:r>
+    </w:p>
+    <w:p>
+      <w:pPr>
+        <w:pStyle w:val="IOP-CS-BodyText"/>
+      </w:pPr>
+      <w:r>
+        <w:rPr>
+          <w:rFonts w:ascii="Times New Roman" w:hAnsi="Times New Roman" w:eastAsia="Times New Roman"/>
         </w:rPr>
         <w:t>For smooth convergence verification, the exact solution is chosen in closed form and f is generated analytically for the constant and smooth coefficient cases. Errors are reported as the interior-node root-mean-square (normalised discrete L2) and maximum norms. The observed convergence rate is obtained by a least-squares fit of log(error) against log(h). A separate one-dimensional verification problem uses k(x) = k1 for x &lt; 1/2 and k(x) = k2 for x &gt; 1/2 with u(0) = 0 and u(1) = 1. Its analytic solution is piecewise linear and satisfies continuity of both u and k ux at the interface; this test isolates whether arithmetic and harmonic face averages respect the expected interface flux.</w:t>
       </w:r>
@@ -1485,6 +1525,33 @@
           <w:rFonts w:ascii="Times New Roman" w:hAnsi="Times New Roman" w:eastAsia="Times New Roman"/>
         </w:rPr>
         <w:t>The assembled sparse matrix is solved with three methods: unpreconditioned CG, Jacobi-preconditioned CG, and algebraic-multigrid preconditioned CG. The AMG case uses the tested PyAMG default smoothed-aggregation hierarchy as a V-cycle preconditioner for SciPy CG; this should be read as one concrete AMG configuration rather than a claim about all AMG parameter choices. The recorded PyAMG 5.3.0 defaults use symmetric strength, standard aggregation, Jacobi prolongation smoothing with omega = 4/3, symmetric block Gauss-Seidel pre/post smoothing, at most ten levels, and a coarse-grid limit of ten unknowns. Historical runs did not fix the random starts used in PyAMG spectral-radius estimation, so exact hierarchy-dependent results can vary across reruns. Manufactured-solution runs use a relative residual tolerance of 1e-11 so that solver error does not dominate discretisation error; solver-comparison runs use SciPy CG with relative tolerance 1e-8, zero absolute tolerance, the default zero initial guess, and a maximum of 12000 iterations in the decision map. The baseline coefficient-family solver comparisons use the same deterministic unit right-hand side at a given grid size, so the right-hand side is controlled across cases. The controlled extension below separately varies the right-hand side, which can excite different spectral components. The reported time separates preconditioner setup from iterative solve time and also gives the total time. Matrix assembly and right-hand-side construction are excluded from these times. Iterative solve times include a callback that recomputes the true relative residual after every iteration, adding one sparse matrix-vector product and norm evaluations per iteration. The reported selections and speedups therefore apply to this monitored implementation. Methods are run in a fixed order, and the first AMG setup in a fresh process also includes the PyAMG import; these timings do not isolate hierarchy construction from first-use overhead. BLAS thread settings and processor power states were not recorded, limiting exact performance replication. Failed convergence would be recorded as a structured row in the raw CSV artefact, although all baseline benchmark cases converged.</w:t>
+      </w:r>
+    </w:p>
+    <w:p>
+      <w:pPr>
+        <w:pStyle w:val="IOP-CS-BodyText"/>
+      </w:pPr>
+      <w:r>
+        <w:rPr>
+          <w:rFonts w:ascii="Times New Roman" w:hAnsi="Times New Roman" w:eastAsia="Times New Roman"/>
+          <w:highlight w:val="yellow"/>
+        </w:rPr>
+        <w:t xml:space="preserve">Three evidence groups have distinct timing meanings </w:t>
+      </w:r>
+      <w:r>
+        <w:rPr>
+          <w:rFonts w:ascii="Times New Roman" w:hAnsi="Times New Roman" w:eastAsia="Times New Roman"/>
+          <w:vertAlign w:val="superscript"/>
+          <w:highlight w:val="yellow"/>
+        </w:rPr>
+        <w:t xml:space="preserve">[27]</w:t>
+      </w:r>
+      <w:r>
+        <w:rPr>
+          <w:rFonts w:ascii="Times New Roman" w:hAnsi="Times New Roman" w:eastAsia="Times New Roman"/>
+          <w:highlight w:val="yellow"/>
+        </w:rPr>
+        <w:t xml:space="preserve">. Historical coefficient-family results include a true-residual evaluation at every iteration, fixed method order and the first PyAMG import inside setup; their thread settings were not recorded. The controlled matched-field extension uses warm imports, shuffled order, one BLAS thread, paired setup seeds and count-only callbacks, with rtol = 1e-9 and independently checked residual at most 1e-8. The new callback calibration holds the arithmetic operator, unit source, three candidate methods, rtol = 1e-8, warm imports, one BLAS thread and setup seeds fixed, changing only the callback within each pair. All three groups exclude matrix assembly and source construction, and include fresh preconditioner setup in total time. Historical speedups are monitored-implementation results; translation reversals and empirical cost floors are within-extension comparisons. Neither time ratios nor winner boundaries are pooled across these groups. The calibration estimates callback sensitivity under its stated conditions; it cannot retrospectively separate historical import, ordering, threading or machine-state effects.</w:t>
       </w:r>
     </w:p>
     <w:p>
@@ -4034,8 +4101,9 @@
       <w:r>
         <w:rPr>
           <w:rFonts w:ascii="Times New Roman" w:hAnsi="Times New Roman" w:eastAsia="Times New Roman"/>
-        </w:rPr>
-        <w:t>The supplementary face-averaging sensitivity table tests whether the discontinuous high-contrast solver conclusions are an artefact of arithmetic face averaging. Replacing arithmetic by harmonic averaging changed condition estimates and iteration counts, especially for checkerboard fields, but the fastest solver class was unchanged in all nine tested case-size cells: Jacobi-PCG remained fastest at N = 64, and AMG-PCG remained fastest at N = 128 and N = 256.</w:t>
+          <w:highlight w:val="yellow"/>
+        </w:rPr>
+        <w:t xml:space="preserve">The complete arithmetic/harmonic sensitivity results are reported below in Table 6.</w:t>
       </w:r>
     </w:p>
     <w:p>
@@ -4823,6 +4891,1254 @@
     </w:p>
     <w:p>
       <w:pPr>
+        <w:pStyle w:val="IOP-CS-BodyText"/>
+      </w:pPr>
+      <w:r>
+        <w:rPr>
+          <w:rFonts w:ascii="Times New Roman" w:hAnsi="Times New Roman" w:eastAsia="Times New Roman"/>
+          <w:highlight w:val="yellow"/>
+        </w:rPr>
+        <w:t xml:space="preserve">The complete face-averaging check in Table 6 reports all nine historical case-size cells. Arithmetic/harmonic iteration counts differ substantially, including AMG changes for checkerboard fields, although the setup-inclusive winner is unchanged in these single passes. Agreement of winners does not establish physical equivalence of the operators, timing stability, or identical solution accuracy. The aligned one-dimensional verification and the two-dimensional solver-cost sensitivity answer separate questions.</w:t>
+      </w:r>
+    </w:p>
+    <w:p>
+      <w:pPr>
+        <w:pStyle w:val="IOP-CS-CaptionText"/>
+        <w:keepNext/>
+        <w:keepLines/>
+      </w:pPr>
+      <w:r>
+        <w:rPr>
+          <w:rFonts w:ascii="Times New Roman" w:hAnsi="Times New Roman" w:eastAsia="Times New Roman"/>
+          <w:highlight w:val="yellow"/>
+        </w:rPr>
+        <w:t xml:space="preserve">Table 6. Complete contrast-100 face-averaging check under the historical monitored protocol. Entries are arithmetic/harmonic iteration counts and setup-inclusive winners (J = Jacobi-PCG, SA = AMG-PCG). These are single timing passes, not uncertainty estimates.</w:t>
+      </w:r>
+    </w:p>
+    <w:tbl>
+      <w:tblPr>
+        <w:tblStyle w:val="TableGrid"/>
+        <w:tblW w:type="auto" w:w="0"/>
+        <w:tblLook w:firstColumn="1" w:firstRow="1" w:lastColumn="0" w:lastRow="0" w:noHBand="0" w:noVBand="1" w:val="04A0"/>
+      </w:tblPr>
+      <w:tblGrid>
+        <w:gridCol w:w="1512"/>
+        <w:gridCol w:w="1512"/>
+        <w:gridCol w:w="1512"/>
+        <w:gridCol w:w="1512"/>
+        <w:gridCol w:w="1512"/>
+        <w:gridCol w:w="1512"/>
+      </w:tblGrid>
+      <w:tr>
+        <w:trPr>
+          <w:tblHeader/>
+        </w:trPr>
+        <w:tc>
+          <w:tcPr>
+            <w:tcW w:type="dxa" w:w="1512"/>
+          </w:tcPr>
+          <w:p>
+            <w:pPr>
+              <w:keepNext/>
+              <w:keepLines/>
+            </w:pPr>
+            <w:r>
+              <w:rPr>
+                <w:rFonts w:ascii="Times New Roman" w:hAnsi="Times New Roman" w:eastAsia="Times New Roman"/>
+                <w:b/>
+                <w:sz w:val="18"/>
+                <w:highlight w:val="yellow"/>
+              </w:rPr>
+              <w:t xml:space="preserve">Case</w:t>
+            </w:r>
+          </w:p>
+        </w:tc>
+        <w:tc>
+          <w:tcPr>
+            <w:tcW w:type="dxa" w:w="1512"/>
+          </w:tcPr>
+          <w:p>
+            <w:pPr>
+              <w:keepNext/>
+              <w:keepLines/>
+            </w:pPr>
+            <w:r>
+              <w:rPr>
+                <w:rFonts w:ascii="Times New Roman" w:hAnsi="Times New Roman" w:eastAsia="Times New Roman"/>
+                <w:b/>
+                <w:sz w:val="18"/>
+                <w:highlight w:val="yellow"/>
+              </w:rPr>
+              <w:t xml:space="preserve">N</w:t>
+            </w:r>
+          </w:p>
+        </w:tc>
+        <w:tc>
+          <w:tcPr>
+            <w:tcW w:type="dxa" w:w="1512"/>
+          </w:tcPr>
+          <w:p>
+            <w:pPr>
+              <w:keepNext/>
+              <w:keepLines/>
+            </w:pPr>
+            <w:r>
+              <w:rPr>
+                <w:rFonts w:ascii="Times New Roman" w:hAnsi="Times New Roman" w:eastAsia="Times New Roman"/>
+                <w:b/>
+                <w:sz w:val="18"/>
+                <w:highlight w:val="yellow"/>
+              </w:rPr>
+              <w:t xml:space="preserve">CG</w:t>
+            </w:r>
+          </w:p>
+        </w:tc>
+        <w:tc>
+          <w:tcPr>
+            <w:tcW w:type="dxa" w:w="1512"/>
+          </w:tcPr>
+          <w:p>
+            <w:pPr>
+              <w:keepNext/>
+              <w:keepLines/>
+            </w:pPr>
+            <w:r>
+              <w:rPr>
+                <w:rFonts w:ascii="Times New Roman" w:hAnsi="Times New Roman" w:eastAsia="Times New Roman"/>
+                <w:b/>
+                <w:sz w:val="18"/>
+                <w:highlight w:val="yellow"/>
+              </w:rPr>
+              <w:t xml:space="preserve">J</w:t>
+            </w:r>
+          </w:p>
+        </w:tc>
+        <w:tc>
+          <w:tcPr>
+            <w:tcW w:type="dxa" w:w="1512"/>
+          </w:tcPr>
+          <w:p>
+            <w:pPr>
+              <w:keepNext/>
+              <w:keepLines/>
+            </w:pPr>
+            <w:r>
+              <w:rPr>
+                <w:rFonts w:ascii="Times New Roman" w:hAnsi="Times New Roman" w:eastAsia="Times New Roman"/>
+                <w:b/>
+                <w:sz w:val="18"/>
+                <w:highlight w:val="yellow"/>
+              </w:rPr>
+              <w:t xml:space="preserve">SA</w:t>
+            </w:r>
+          </w:p>
+        </w:tc>
+        <w:tc>
+          <w:tcPr>
+            <w:tcW w:type="dxa" w:w="1512"/>
+          </w:tcPr>
+          <w:p>
+            <w:pPr>
+              <w:keepNext/>
+              <w:keepLines/>
+            </w:pPr>
+            <w:r>
+              <w:rPr>
+                <w:rFonts w:ascii="Times New Roman" w:hAnsi="Times New Roman" w:eastAsia="Times New Roman"/>
+                <w:b/>
+                <w:sz w:val="18"/>
+                <w:highlight w:val="yellow"/>
+              </w:rPr>
+              <w:t xml:space="preserve">Winner</w:t>
+            </w:r>
+          </w:p>
+        </w:tc>
+      </w:tr>
+      <w:tr>
+        <w:trPr>
+          <w:cantSplit/>
+        </w:trPr>
+        <w:tc>
+          <w:tcPr>
+            <w:tcW w:type="dxa" w:w="1512"/>
+          </w:tcPr>
+          <w:p>
+            <w:pPr>
+              <w:keepNext/>
+              <w:keepLines/>
+            </w:pPr>
+            <w:r>
+              <w:rPr>
+                <w:rFonts w:ascii="Times New Roman" w:hAnsi="Times New Roman" w:eastAsia="Times New Roman"/>
+                <w:sz w:val="18"/>
+                <w:highlight w:val="yellow"/>
+              </w:rPr>
+              <w:t xml:space="preserve">Inclusion</w:t>
+            </w:r>
+          </w:p>
+        </w:tc>
+        <w:tc>
+          <w:tcPr>
+            <w:tcW w:type="dxa" w:w="1512"/>
+          </w:tcPr>
+          <w:p>
+            <w:pPr>
+              <w:keepNext/>
+              <w:keepLines/>
+            </w:pPr>
+            <w:r>
+              <w:rPr>
+                <w:rFonts w:ascii="Times New Roman" w:hAnsi="Times New Roman" w:eastAsia="Times New Roman"/>
+                <w:sz w:val="18"/>
+                <w:highlight w:val="yellow"/>
+              </w:rPr>
+              <w:t xml:space="preserve">64</w:t>
+            </w:r>
+          </w:p>
+        </w:tc>
+        <w:tc>
+          <w:tcPr>
+            <w:tcW w:type="dxa" w:w="1512"/>
+          </w:tcPr>
+          <w:p>
+            <w:pPr>
+              <w:keepNext/>
+              <w:keepLines/>
+            </w:pPr>
+            <w:r>
+              <w:rPr>
+                <w:rFonts w:ascii="Times New Roman" w:hAnsi="Times New Roman" w:eastAsia="Times New Roman"/>
+                <w:sz w:val="18"/>
+                <w:highlight w:val="yellow"/>
+              </w:rPr>
+              <w:t xml:space="preserve">796/725</w:t>
+            </w:r>
+          </w:p>
+        </w:tc>
+        <w:tc>
+          <w:tcPr>
+            <w:tcW w:type="dxa" w:w="1512"/>
+          </w:tcPr>
+          <w:p>
+            <w:pPr>
+              <w:keepNext/>
+              <w:keepLines/>
+            </w:pPr>
+            <w:r>
+              <w:rPr>
+                <w:rFonts w:ascii="Times New Roman" w:hAnsi="Times New Roman" w:eastAsia="Times New Roman"/>
+                <w:sz w:val="18"/>
+                <w:highlight w:val="yellow"/>
+              </w:rPr>
+              <w:t xml:space="preserve">129/129</w:t>
+            </w:r>
+          </w:p>
+        </w:tc>
+        <w:tc>
+          <w:tcPr>
+            <w:tcW w:type="dxa" w:w="1512"/>
+          </w:tcPr>
+          <w:p>
+            <w:pPr>
+              <w:keepNext/>
+              <w:keepLines/>
+            </w:pPr>
+            <w:r>
+              <w:rPr>
+                <w:rFonts w:ascii="Times New Roman" w:hAnsi="Times New Roman" w:eastAsia="Times New Roman"/>
+                <w:sz w:val="18"/>
+                <w:highlight w:val="yellow"/>
+              </w:rPr>
+              <w:t xml:space="preserve">10/10</w:t>
+            </w:r>
+          </w:p>
+        </w:tc>
+        <w:tc>
+          <w:tcPr>
+            <w:tcW w:type="dxa" w:w="1512"/>
+          </w:tcPr>
+          <w:p>
+            <w:pPr>
+              <w:keepNext/>
+              <w:keepLines/>
+            </w:pPr>
+            <w:r>
+              <w:rPr>
+                <w:rFonts w:ascii="Times New Roman" w:hAnsi="Times New Roman" w:eastAsia="Times New Roman"/>
+                <w:sz w:val="18"/>
+                <w:highlight w:val="yellow"/>
+              </w:rPr>
+              <w:t xml:space="preserve">J/J</w:t>
+            </w:r>
+          </w:p>
+        </w:tc>
+      </w:tr>
+      <w:tr>
+        <w:trPr>
+          <w:cantSplit/>
+        </w:trPr>
+        <w:tc>
+          <w:tcPr>
+            <w:tcW w:type="dxa" w:w="1512"/>
+          </w:tcPr>
+          <w:p>
+            <w:pPr>
+              <w:keepNext/>
+              <w:keepLines/>
+            </w:pPr>
+            <w:r>
+              <w:rPr>
+                <w:rFonts w:ascii="Times New Roman" w:hAnsi="Times New Roman" w:eastAsia="Times New Roman"/>
+                <w:sz w:val="18"/>
+                <w:highlight w:val="yellow"/>
+              </w:rPr>
+              <w:t xml:space="preserve">Inclusion</w:t>
+            </w:r>
+          </w:p>
+        </w:tc>
+        <w:tc>
+          <w:tcPr>
+            <w:tcW w:type="dxa" w:w="1512"/>
+          </w:tcPr>
+          <w:p>
+            <w:pPr>
+              <w:keepNext/>
+              <w:keepLines/>
+            </w:pPr>
+            <w:r>
+              <w:rPr>
+                <w:rFonts w:ascii="Times New Roman" w:hAnsi="Times New Roman" w:eastAsia="Times New Roman"/>
+                <w:sz w:val="18"/>
+                <w:highlight w:val="yellow"/>
+              </w:rPr>
+              <w:t xml:space="preserve">128</w:t>
+            </w:r>
+          </w:p>
+        </w:tc>
+        <w:tc>
+          <w:tcPr>
+            <w:tcW w:type="dxa" w:w="1512"/>
+          </w:tcPr>
+          <w:p>
+            <w:pPr>
+              <w:keepNext/>
+              <w:keepLines/>
+            </w:pPr>
+            <w:r>
+              <w:rPr>
+                <w:rFonts w:ascii="Times New Roman" w:hAnsi="Times New Roman" w:eastAsia="Times New Roman"/>
+                <w:sz w:val="18"/>
+                <w:highlight w:val="yellow"/>
+              </w:rPr>
+              <w:t xml:space="preserve">1963/1891</w:t>
+            </w:r>
+          </w:p>
+        </w:tc>
+        <w:tc>
+          <w:tcPr>
+            <w:tcW w:type="dxa" w:w="1512"/>
+          </w:tcPr>
+          <w:p>
+            <w:pPr>
+              <w:keepNext/>
+              <w:keepLines/>
+            </w:pPr>
+            <w:r>
+              <w:rPr>
+                <w:rFonts w:ascii="Times New Roman" w:hAnsi="Times New Roman" w:eastAsia="Times New Roman"/>
+                <w:sz w:val="18"/>
+                <w:highlight w:val="yellow"/>
+              </w:rPr>
+              <w:t xml:space="preserve">264/263</w:t>
+            </w:r>
+          </w:p>
+        </w:tc>
+        <w:tc>
+          <w:tcPr>
+            <w:tcW w:type="dxa" w:w="1512"/>
+          </w:tcPr>
+          <w:p>
+            <w:pPr>
+              <w:keepNext/>
+              <w:keepLines/>
+            </w:pPr>
+            <w:r>
+              <w:rPr>
+                <w:rFonts w:ascii="Times New Roman" w:hAnsi="Times New Roman" w:eastAsia="Times New Roman"/>
+                <w:sz w:val="18"/>
+                <w:highlight w:val="yellow"/>
+              </w:rPr>
+              <w:t xml:space="preserve">12/11</w:t>
+            </w:r>
+          </w:p>
+        </w:tc>
+        <w:tc>
+          <w:tcPr>
+            <w:tcW w:type="dxa" w:w="1512"/>
+          </w:tcPr>
+          <w:p>
+            <w:pPr>
+              <w:keepNext/>
+              <w:keepLines/>
+            </w:pPr>
+            <w:r>
+              <w:rPr>
+                <w:rFonts w:ascii="Times New Roman" w:hAnsi="Times New Roman" w:eastAsia="Times New Roman"/>
+                <w:sz w:val="18"/>
+                <w:highlight w:val="yellow"/>
+              </w:rPr>
+              <w:t xml:space="preserve">SA/SA</w:t>
+            </w:r>
+          </w:p>
+        </w:tc>
+      </w:tr>
+      <w:tr>
+        <w:trPr>
+          <w:cantSplit/>
+        </w:trPr>
+        <w:tc>
+          <w:tcPr>
+            <w:tcW w:type="dxa" w:w="1512"/>
+          </w:tcPr>
+          <w:p>
+            <w:pPr>
+              <w:keepNext/>
+              <w:keepLines/>
+            </w:pPr>
+            <w:r>
+              <w:rPr>
+                <w:rFonts w:ascii="Times New Roman" w:hAnsi="Times New Roman" w:eastAsia="Times New Roman"/>
+                <w:sz w:val="18"/>
+                <w:highlight w:val="yellow"/>
+              </w:rPr>
+              <w:t xml:space="preserve">Inclusion</w:t>
+            </w:r>
+          </w:p>
+        </w:tc>
+        <w:tc>
+          <w:tcPr>
+            <w:tcW w:type="dxa" w:w="1512"/>
+          </w:tcPr>
+          <w:p>
+            <w:pPr>
+              <w:keepNext/>
+              <w:keepLines/>
+            </w:pPr>
+            <w:r>
+              <w:rPr>
+                <w:rFonts w:ascii="Times New Roman" w:hAnsi="Times New Roman" w:eastAsia="Times New Roman"/>
+                <w:sz w:val="18"/>
+                <w:highlight w:val="yellow"/>
+              </w:rPr>
+              <w:t xml:space="preserve">256</w:t>
+            </w:r>
+          </w:p>
+        </w:tc>
+        <w:tc>
+          <w:tcPr>
+            <w:tcW w:type="dxa" w:w="1512"/>
+          </w:tcPr>
+          <w:p>
+            <w:pPr>
+              <w:keepNext/>
+              <w:keepLines/>
+            </w:pPr>
+            <w:r>
+              <w:rPr>
+                <w:rFonts w:ascii="Times New Roman" w:hAnsi="Times New Roman" w:eastAsia="Times New Roman"/>
+                <w:sz w:val="18"/>
+                <w:highlight w:val="yellow"/>
+              </w:rPr>
+              <w:t xml:space="preserve">4370/4326</w:t>
+            </w:r>
+          </w:p>
+        </w:tc>
+        <w:tc>
+          <w:tcPr>
+            <w:tcW w:type="dxa" w:w="1512"/>
+          </w:tcPr>
+          <w:p>
+            <w:pPr>
+              <w:keepNext/>
+              <w:keepLines/>
+            </w:pPr>
+            <w:r>
+              <w:rPr>
+                <w:rFonts w:ascii="Times New Roman" w:hAnsi="Times New Roman" w:eastAsia="Times New Roman"/>
+                <w:sz w:val="18"/>
+                <w:highlight w:val="yellow"/>
+              </w:rPr>
+              <w:t xml:space="preserve">535/535</w:t>
+            </w:r>
+          </w:p>
+        </w:tc>
+        <w:tc>
+          <w:tcPr>
+            <w:tcW w:type="dxa" w:w="1512"/>
+          </w:tcPr>
+          <w:p>
+            <w:pPr>
+              <w:keepNext/>
+              <w:keepLines/>
+            </w:pPr>
+            <w:r>
+              <w:rPr>
+                <w:rFonts w:ascii="Times New Roman" w:hAnsi="Times New Roman" w:eastAsia="Times New Roman"/>
+                <w:sz w:val="18"/>
+                <w:highlight w:val="yellow"/>
+              </w:rPr>
+              <w:t xml:space="preserve">12/12</w:t>
+            </w:r>
+          </w:p>
+        </w:tc>
+        <w:tc>
+          <w:tcPr>
+            <w:tcW w:type="dxa" w:w="1512"/>
+          </w:tcPr>
+          <w:p>
+            <w:pPr>
+              <w:keepNext/>
+              <w:keepLines/>
+            </w:pPr>
+            <w:r>
+              <w:rPr>
+                <w:rFonts w:ascii="Times New Roman" w:hAnsi="Times New Roman" w:eastAsia="Times New Roman"/>
+                <w:sz w:val="18"/>
+                <w:highlight w:val="yellow"/>
+              </w:rPr>
+              <w:t xml:space="preserve">SA/SA</w:t>
+            </w:r>
+          </w:p>
+        </w:tc>
+      </w:tr>
+      <w:tr>
+        <w:trPr>
+          <w:cantSplit/>
+        </w:trPr>
+        <w:tc>
+          <w:tcPr>
+            <w:tcW w:type="dxa" w:w="1512"/>
+          </w:tcPr>
+          <w:p>
+            <w:pPr>
+              <w:keepNext/>
+              <w:keepLines/>
+            </w:pPr>
+            <w:r>
+              <w:rPr>
+                <w:rFonts w:ascii="Times New Roman" w:hAnsi="Times New Roman" w:eastAsia="Times New Roman"/>
+                <w:sz w:val="18"/>
+                <w:highlight w:val="yellow"/>
+              </w:rPr>
+              <w:t xml:space="preserve">Layered</w:t>
+            </w:r>
+          </w:p>
+        </w:tc>
+        <w:tc>
+          <w:tcPr>
+            <w:tcW w:type="dxa" w:w="1512"/>
+          </w:tcPr>
+          <w:p>
+            <w:pPr>
+              <w:keepNext/>
+              <w:keepLines/>
+            </w:pPr>
+            <w:r>
+              <w:rPr>
+                <w:rFonts w:ascii="Times New Roman" w:hAnsi="Times New Roman" w:eastAsia="Times New Roman"/>
+                <w:sz w:val="18"/>
+                <w:highlight w:val="yellow"/>
+              </w:rPr>
+              <w:t xml:space="preserve">64</w:t>
+            </w:r>
+          </w:p>
+        </w:tc>
+        <w:tc>
+          <w:tcPr>
+            <w:tcW w:type="dxa" w:w="1512"/>
+          </w:tcPr>
+          <w:p>
+            <w:pPr>
+              <w:keepNext/>
+              <w:keepLines/>
+            </w:pPr>
+            <w:r>
+              <w:rPr>
+                <w:rFonts w:ascii="Times New Roman" w:hAnsi="Times New Roman" w:eastAsia="Times New Roman"/>
+                <w:sz w:val="18"/>
+                <w:highlight w:val="yellow"/>
+              </w:rPr>
+              <w:t xml:space="preserve">1136/1120</w:t>
+            </w:r>
+          </w:p>
+        </w:tc>
+        <w:tc>
+          <w:tcPr>
+            <w:tcW w:type="dxa" w:w="1512"/>
+          </w:tcPr>
+          <w:p>
+            <w:pPr>
+              <w:keepNext/>
+              <w:keepLines/>
+            </w:pPr>
+            <w:r>
+              <w:rPr>
+                <w:rFonts w:ascii="Times New Roman" w:hAnsi="Times New Roman" w:eastAsia="Times New Roman"/>
+                <w:sz w:val="18"/>
+                <w:highlight w:val="yellow"/>
+              </w:rPr>
+              <w:t xml:space="preserve">164/181</w:t>
+            </w:r>
+          </w:p>
+        </w:tc>
+        <w:tc>
+          <w:tcPr>
+            <w:tcW w:type="dxa" w:w="1512"/>
+          </w:tcPr>
+          <w:p>
+            <w:pPr>
+              <w:keepNext/>
+              <w:keepLines/>
+            </w:pPr>
+            <w:r>
+              <w:rPr>
+                <w:rFonts w:ascii="Times New Roman" w:hAnsi="Times New Roman" w:eastAsia="Times New Roman"/>
+                <w:sz w:val="18"/>
+                <w:highlight w:val="yellow"/>
+              </w:rPr>
+              <w:t xml:space="preserve">9/9</w:t>
+            </w:r>
+          </w:p>
+        </w:tc>
+        <w:tc>
+          <w:tcPr>
+            <w:tcW w:type="dxa" w:w="1512"/>
+          </w:tcPr>
+          <w:p>
+            <w:pPr>
+              <w:keepNext/>
+              <w:keepLines/>
+            </w:pPr>
+            <w:r>
+              <w:rPr>
+                <w:rFonts w:ascii="Times New Roman" w:hAnsi="Times New Roman" w:eastAsia="Times New Roman"/>
+                <w:sz w:val="18"/>
+                <w:highlight w:val="yellow"/>
+              </w:rPr>
+              <w:t xml:space="preserve">J/J</w:t>
+            </w:r>
+          </w:p>
+        </w:tc>
+      </w:tr>
+      <w:tr>
+        <w:trPr>
+          <w:cantSplit/>
+        </w:trPr>
+        <w:tc>
+          <w:tcPr>
+            <w:tcW w:type="dxa" w:w="1512"/>
+          </w:tcPr>
+          <w:p>
+            <w:pPr>
+              <w:keepNext/>
+              <w:keepLines/>
+            </w:pPr>
+            <w:r>
+              <w:rPr>
+                <w:rFonts w:ascii="Times New Roman" w:hAnsi="Times New Roman" w:eastAsia="Times New Roman"/>
+                <w:sz w:val="18"/>
+                <w:highlight w:val="yellow"/>
+              </w:rPr>
+              <w:t xml:space="preserve">Layered</w:t>
+            </w:r>
+          </w:p>
+        </w:tc>
+        <w:tc>
+          <w:tcPr>
+            <w:tcW w:type="dxa" w:w="1512"/>
+          </w:tcPr>
+          <w:p>
+            <w:pPr>
+              <w:keepNext/>
+              <w:keepLines/>
+            </w:pPr>
+            <w:r>
+              <w:rPr>
+                <w:rFonts w:ascii="Times New Roman" w:hAnsi="Times New Roman" w:eastAsia="Times New Roman"/>
+                <w:sz w:val="18"/>
+                <w:highlight w:val="yellow"/>
+              </w:rPr>
+              <w:t xml:space="preserve">128</w:t>
+            </w:r>
+          </w:p>
+        </w:tc>
+        <w:tc>
+          <w:tcPr>
+            <w:tcW w:type="dxa" w:w="1512"/>
+          </w:tcPr>
+          <w:p>
+            <w:pPr>
+              <w:keepNext/>
+              <w:keepLines/>
+            </w:pPr>
+            <w:r>
+              <w:rPr>
+                <w:rFonts w:ascii="Times New Roman" w:hAnsi="Times New Roman" w:eastAsia="Times New Roman"/>
+                <w:sz w:val="18"/>
+                <w:highlight w:val="yellow"/>
+              </w:rPr>
+              <w:t xml:space="preserve">2447/2442</w:t>
+            </w:r>
+          </w:p>
+        </w:tc>
+        <w:tc>
+          <w:tcPr>
+            <w:tcW w:type="dxa" w:w="1512"/>
+          </w:tcPr>
+          <w:p>
+            <w:pPr>
+              <w:keepNext/>
+              <w:keepLines/>
+            </w:pPr>
+            <w:r>
+              <w:rPr>
+                <w:rFonts w:ascii="Times New Roman" w:hAnsi="Times New Roman" w:eastAsia="Times New Roman"/>
+                <w:sz w:val="18"/>
+                <w:highlight w:val="yellow"/>
+              </w:rPr>
+              <w:t xml:space="preserve">325/367</w:t>
+            </w:r>
+          </w:p>
+        </w:tc>
+        <w:tc>
+          <w:tcPr>
+            <w:tcW w:type="dxa" w:w="1512"/>
+          </w:tcPr>
+          <w:p>
+            <w:pPr>
+              <w:keepNext/>
+              <w:keepLines/>
+            </w:pPr>
+            <w:r>
+              <w:rPr>
+                <w:rFonts w:ascii="Times New Roman" w:hAnsi="Times New Roman" w:eastAsia="Times New Roman"/>
+                <w:sz w:val="18"/>
+                <w:highlight w:val="yellow"/>
+              </w:rPr>
+              <w:t xml:space="preserve">10/10</w:t>
+            </w:r>
+          </w:p>
+        </w:tc>
+        <w:tc>
+          <w:tcPr>
+            <w:tcW w:type="dxa" w:w="1512"/>
+          </w:tcPr>
+          <w:p>
+            <w:pPr>
+              <w:keepNext/>
+              <w:keepLines/>
+            </w:pPr>
+            <w:r>
+              <w:rPr>
+                <w:rFonts w:ascii="Times New Roman" w:hAnsi="Times New Roman" w:eastAsia="Times New Roman"/>
+                <w:sz w:val="18"/>
+                <w:highlight w:val="yellow"/>
+              </w:rPr>
+              <w:t xml:space="preserve">SA/SA</w:t>
+            </w:r>
+          </w:p>
+        </w:tc>
+      </w:tr>
+      <w:tr>
+        <w:trPr>
+          <w:cantSplit/>
+        </w:trPr>
+        <w:tc>
+          <w:tcPr>
+            <w:tcW w:type="dxa" w:w="1512"/>
+          </w:tcPr>
+          <w:p>
+            <w:pPr>
+              <w:keepNext/>
+              <w:keepLines/>
+            </w:pPr>
+            <w:r>
+              <w:rPr>
+                <w:rFonts w:ascii="Times New Roman" w:hAnsi="Times New Roman" w:eastAsia="Times New Roman"/>
+                <w:sz w:val="18"/>
+                <w:highlight w:val="yellow"/>
+              </w:rPr>
+              <w:t xml:space="preserve">Layered</w:t>
+            </w:r>
+          </w:p>
+        </w:tc>
+        <w:tc>
+          <w:tcPr>
+            <w:tcW w:type="dxa" w:w="1512"/>
+          </w:tcPr>
+          <w:p>
+            <w:pPr>
+              <w:keepNext/>
+              <w:keepLines/>
+            </w:pPr>
+            <w:r>
+              <w:rPr>
+                <w:rFonts w:ascii="Times New Roman" w:hAnsi="Times New Roman" w:eastAsia="Times New Roman"/>
+                <w:sz w:val="18"/>
+                <w:highlight w:val="yellow"/>
+              </w:rPr>
+              <w:t xml:space="preserve">256</w:t>
+            </w:r>
+          </w:p>
+        </w:tc>
+        <w:tc>
+          <w:tcPr>
+            <w:tcW w:type="dxa" w:w="1512"/>
+          </w:tcPr>
+          <w:p>
+            <w:pPr>
+              <w:keepNext/>
+              <w:keepLines/>
+            </w:pPr>
+            <w:r>
+              <w:rPr>
+                <w:rFonts w:ascii="Times New Roman" w:hAnsi="Times New Roman" w:eastAsia="Times New Roman"/>
+                <w:sz w:val="18"/>
+                <w:highlight w:val="yellow"/>
+              </w:rPr>
+              <w:t xml:space="preserve">5055/5054</w:t>
+            </w:r>
+          </w:p>
+        </w:tc>
+        <w:tc>
+          <w:tcPr>
+            <w:tcW w:type="dxa" w:w="1512"/>
+          </w:tcPr>
+          <w:p>
+            <w:pPr>
+              <w:keepNext/>
+              <w:keepLines/>
+            </w:pPr>
+            <w:r>
+              <w:rPr>
+                <w:rFonts w:ascii="Times New Roman" w:hAnsi="Times New Roman" w:eastAsia="Times New Roman"/>
+                <w:sz w:val="18"/>
+                <w:highlight w:val="yellow"/>
+              </w:rPr>
+              <w:t xml:space="preserve">657/715</w:t>
+            </w:r>
+          </w:p>
+        </w:tc>
+        <w:tc>
+          <w:tcPr>
+            <w:tcW w:type="dxa" w:w="1512"/>
+          </w:tcPr>
+          <w:p>
+            <w:pPr>
+              <w:keepNext/>
+              <w:keepLines/>
+            </w:pPr>
+            <w:r>
+              <w:rPr>
+                <w:rFonts w:ascii="Times New Roman" w:hAnsi="Times New Roman" w:eastAsia="Times New Roman"/>
+                <w:sz w:val="18"/>
+                <w:highlight w:val="yellow"/>
+              </w:rPr>
+              <w:t xml:space="preserve">10/10</w:t>
+            </w:r>
+          </w:p>
+        </w:tc>
+        <w:tc>
+          <w:tcPr>
+            <w:tcW w:type="dxa" w:w="1512"/>
+          </w:tcPr>
+          <w:p>
+            <w:pPr>
+              <w:keepNext/>
+              <w:keepLines/>
+            </w:pPr>
+            <w:r>
+              <w:rPr>
+                <w:rFonts w:ascii="Times New Roman" w:hAnsi="Times New Roman" w:eastAsia="Times New Roman"/>
+                <w:sz w:val="18"/>
+                <w:highlight w:val="yellow"/>
+              </w:rPr>
+              <w:t xml:space="preserve">SA/SA</w:t>
+            </w:r>
+          </w:p>
+        </w:tc>
+      </w:tr>
+      <w:tr>
+        <w:trPr>
+          <w:cantSplit/>
+        </w:trPr>
+        <w:tc>
+          <w:tcPr>
+            <w:tcW w:type="dxa" w:w="1512"/>
+          </w:tcPr>
+          <w:p>
+            <w:pPr>
+              <w:keepNext/>
+              <w:keepLines/>
+            </w:pPr>
+            <w:r>
+              <w:rPr>
+                <w:rFonts w:ascii="Times New Roman" w:hAnsi="Times New Roman" w:eastAsia="Times New Roman"/>
+                <w:sz w:val="18"/>
+                <w:highlight w:val="yellow"/>
+              </w:rPr>
+              <w:t xml:space="preserve">Checkerboard</w:t>
+            </w:r>
+          </w:p>
+        </w:tc>
+        <w:tc>
+          <w:tcPr>
+            <w:tcW w:type="dxa" w:w="1512"/>
+          </w:tcPr>
+          <w:p>
+            <w:pPr>
+              <w:keepNext/>
+              <w:keepLines/>
+            </w:pPr>
+            <w:r>
+              <w:rPr>
+                <w:rFonts w:ascii="Times New Roman" w:hAnsi="Times New Roman" w:eastAsia="Times New Roman"/>
+                <w:sz w:val="18"/>
+                <w:highlight w:val="yellow"/>
+              </w:rPr>
+              <w:t xml:space="preserve">64</w:t>
+            </w:r>
+          </w:p>
+        </w:tc>
+        <w:tc>
+          <w:tcPr>
+            <w:tcW w:type="dxa" w:w="1512"/>
+          </w:tcPr>
+          <w:p>
+            <w:pPr>
+              <w:keepNext/>
+              <w:keepLines/>
+            </w:pPr>
+            <w:r>
+              <w:rPr>
+                <w:rFonts w:ascii="Times New Roman" w:hAnsi="Times New Roman" w:eastAsia="Times New Roman"/>
+                <w:sz w:val="18"/>
+                <w:highlight w:val="yellow"/>
+              </w:rPr>
+              <w:t xml:space="preserve">443/557</w:t>
+            </w:r>
+          </w:p>
+        </w:tc>
+        <w:tc>
+          <w:tcPr>
+            <w:tcW w:type="dxa" w:w="1512"/>
+          </w:tcPr>
+          <w:p>
+            <w:pPr>
+              <w:keepNext/>
+              <w:keepLines/>
+            </w:pPr>
+            <w:r>
+              <w:rPr>
+                <w:rFonts w:ascii="Times New Roman" w:hAnsi="Times New Roman" w:eastAsia="Times New Roman"/>
+                <w:sz w:val="18"/>
+                <w:highlight w:val="yellow"/>
+              </w:rPr>
+              <w:t xml:space="preserve">171/190</w:t>
+            </w:r>
+          </w:p>
+        </w:tc>
+        <w:tc>
+          <w:tcPr>
+            <w:tcW w:type="dxa" w:w="1512"/>
+          </w:tcPr>
+          <w:p>
+            <w:pPr>
+              <w:keepNext/>
+              <w:keepLines/>
+            </w:pPr>
+            <w:r>
+              <w:rPr>
+                <w:rFonts w:ascii="Times New Roman" w:hAnsi="Times New Roman" w:eastAsia="Times New Roman"/>
+                <w:sz w:val="18"/>
+                <w:highlight w:val="yellow"/>
+              </w:rPr>
+              <w:t xml:space="preserve">13/28</w:t>
+            </w:r>
+          </w:p>
+        </w:tc>
+        <w:tc>
+          <w:tcPr>
+            <w:tcW w:type="dxa" w:w="1512"/>
+          </w:tcPr>
+          <w:p>
+            <w:pPr>
+              <w:keepNext/>
+              <w:keepLines/>
+            </w:pPr>
+            <w:r>
+              <w:rPr>
+                <w:rFonts w:ascii="Times New Roman" w:hAnsi="Times New Roman" w:eastAsia="Times New Roman"/>
+                <w:sz w:val="18"/>
+                <w:highlight w:val="yellow"/>
+              </w:rPr>
+              <w:t xml:space="preserve">J/J</w:t>
+            </w:r>
+          </w:p>
+        </w:tc>
+      </w:tr>
+      <w:tr>
+        <w:trPr>
+          <w:cantSplit/>
+        </w:trPr>
+        <w:tc>
+          <w:tcPr>
+            <w:tcW w:type="dxa" w:w="1512"/>
+          </w:tcPr>
+          <w:p>
+            <w:pPr>
+              <w:keepNext/>
+              <w:keepLines/>
+            </w:pPr>
+            <w:r>
+              <w:rPr>
+                <w:rFonts w:ascii="Times New Roman" w:hAnsi="Times New Roman" w:eastAsia="Times New Roman"/>
+                <w:sz w:val="18"/>
+                <w:highlight w:val="yellow"/>
+              </w:rPr>
+              <w:t xml:space="preserve">Checkerboard</w:t>
+            </w:r>
+          </w:p>
+        </w:tc>
+        <w:tc>
+          <w:tcPr>
+            <w:tcW w:type="dxa" w:w="1512"/>
+          </w:tcPr>
+          <w:p>
+            <w:pPr>
+              <w:keepNext/>
+              <w:keepLines/>
+            </w:pPr>
+            <w:r>
+              <w:rPr>
+                <w:rFonts w:ascii="Times New Roman" w:hAnsi="Times New Roman" w:eastAsia="Times New Roman"/>
+                <w:sz w:val="18"/>
+                <w:highlight w:val="yellow"/>
+              </w:rPr>
+              <w:t xml:space="preserve">128</w:t>
+            </w:r>
+          </w:p>
+        </w:tc>
+        <w:tc>
+          <w:tcPr>
+            <w:tcW w:type="dxa" w:w="1512"/>
+          </w:tcPr>
+          <w:p>
+            <w:pPr>
+              <w:keepNext/>
+              <w:keepLines/>
+            </w:pPr>
+            <w:r>
+              <w:rPr>
+                <w:rFonts w:ascii="Times New Roman" w:hAnsi="Times New Roman" w:eastAsia="Times New Roman"/>
+                <w:sz w:val="18"/>
+                <w:highlight w:val="yellow"/>
+              </w:rPr>
+              <w:t xml:space="preserve">1050/1308</w:t>
+            </w:r>
+          </w:p>
+        </w:tc>
+        <w:tc>
+          <w:tcPr>
+            <w:tcW w:type="dxa" w:w="1512"/>
+          </w:tcPr>
+          <w:p>
+            <w:pPr>
+              <w:keepNext/>
+              <w:keepLines/>
+            </w:pPr>
+            <w:r>
+              <w:rPr>
+                <w:rFonts w:ascii="Times New Roman" w:hAnsi="Times New Roman" w:eastAsia="Times New Roman"/>
+                <w:sz w:val="18"/>
+                <w:highlight w:val="yellow"/>
+              </w:rPr>
+              <w:t xml:space="preserve">350/388</w:t>
+            </w:r>
+          </w:p>
+        </w:tc>
+        <w:tc>
+          <w:tcPr>
+            <w:tcW w:type="dxa" w:w="1512"/>
+          </w:tcPr>
+          <w:p>
+            <w:pPr>
+              <w:keepNext/>
+              <w:keepLines/>
+            </w:pPr>
+            <w:r>
+              <w:rPr>
+                <w:rFonts w:ascii="Times New Roman" w:hAnsi="Times New Roman" w:eastAsia="Times New Roman"/>
+                <w:sz w:val="18"/>
+                <w:highlight w:val="yellow"/>
+              </w:rPr>
+              <w:t xml:space="preserve">17/32</w:t>
+            </w:r>
+          </w:p>
+        </w:tc>
+        <w:tc>
+          <w:tcPr>
+            <w:tcW w:type="dxa" w:w="1512"/>
+          </w:tcPr>
+          <w:p>
+            <w:pPr>
+              <w:keepNext/>
+              <w:keepLines/>
+            </w:pPr>
+            <w:r>
+              <w:rPr>
+                <w:rFonts w:ascii="Times New Roman" w:hAnsi="Times New Roman" w:eastAsia="Times New Roman"/>
+                <w:sz w:val="18"/>
+                <w:highlight w:val="yellow"/>
+              </w:rPr>
+              <w:t xml:space="preserve">SA/SA</w:t>
+            </w:r>
+          </w:p>
+        </w:tc>
+      </w:tr>
+      <w:tr>
+        <w:trPr>
+          <w:cantSplit/>
+        </w:trPr>
+        <w:tc>
+          <w:tcPr>
+            <w:tcW w:type="dxa" w:w="1512"/>
+          </w:tcPr>
+          <w:p>
+            <w:pPr>
+              <w:keepNext w:val="0"/>
+              <w:keepLines/>
+            </w:pPr>
+            <w:r>
+              <w:rPr>
+                <w:rFonts w:ascii="Times New Roman" w:hAnsi="Times New Roman" w:eastAsia="Times New Roman"/>
+                <w:sz w:val="18"/>
+                <w:highlight w:val="yellow"/>
+              </w:rPr>
+              <w:t xml:space="preserve">Checkerboard</w:t>
+            </w:r>
+          </w:p>
+        </w:tc>
+        <w:tc>
+          <w:tcPr>
+            <w:tcW w:type="dxa" w:w="1512"/>
+          </w:tcPr>
+          <w:p>
+            <w:pPr>
+              <w:keepNext w:val="0"/>
+              <w:keepLines/>
+            </w:pPr>
+            <w:r>
+              <w:rPr>
+                <w:rFonts w:ascii="Times New Roman" w:hAnsi="Times New Roman" w:eastAsia="Times New Roman"/>
+                <w:sz w:val="18"/>
+                <w:highlight w:val="yellow"/>
+              </w:rPr>
+              <w:t xml:space="preserve">256</w:t>
+            </w:r>
+          </w:p>
+        </w:tc>
+        <w:tc>
+          <w:tcPr>
+            <w:tcW w:type="dxa" w:w="1512"/>
+          </w:tcPr>
+          <w:p>
+            <w:pPr>
+              <w:keepNext w:val="0"/>
+              <w:keepLines/>
+            </w:pPr>
+            <w:r>
+              <w:rPr>
+                <w:rFonts w:ascii="Times New Roman" w:hAnsi="Times New Roman" w:eastAsia="Times New Roman"/>
+                <w:sz w:val="18"/>
+                <w:highlight w:val="yellow"/>
+              </w:rPr>
+              <w:t xml:space="preserve">2268/2809</w:t>
+            </w:r>
+          </w:p>
+        </w:tc>
+        <w:tc>
+          <w:tcPr>
+            <w:tcW w:type="dxa" w:w="1512"/>
+          </w:tcPr>
+          <w:p>
+            <w:pPr>
+              <w:keepNext w:val="0"/>
+              <w:keepLines/>
+            </w:pPr>
+            <w:r>
+              <w:rPr>
+                <w:rFonts w:ascii="Times New Roman" w:hAnsi="Times New Roman" w:eastAsia="Times New Roman"/>
+                <w:sz w:val="18"/>
+                <w:highlight w:val="yellow"/>
+              </w:rPr>
+              <w:t xml:space="preserve">718/783</w:t>
+            </w:r>
+          </w:p>
+        </w:tc>
+        <w:tc>
+          <w:tcPr>
+            <w:tcW w:type="dxa" w:w="1512"/>
+          </w:tcPr>
+          <w:p>
+            <w:pPr>
+              <w:keepNext w:val="0"/>
+              <w:keepLines/>
+            </w:pPr>
+            <w:r>
+              <w:rPr>
+                <w:rFonts w:ascii="Times New Roman" w:hAnsi="Times New Roman" w:eastAsia="Times New Roman"/>
+                <w:sz w:val="18"/>
+                <w:highlight w:val="yellow"/>
+              </w:rPr>
+              <w:t xml:space="preserve">17/31</w:t>
+            </w:r>
+          </w:p>
+        </w:tc>
+        <w:tc>
+          <w:tcPr>
+            <w:tcW w:type="dxa" w:w="1512"/>
+          </w:tcPr>
+          <w:p>
+            <w:pPr>
+              <w:keepNext w:val="0"/>
+              <w:keepLines/>
+            </w:pPr>
+            <w:r>
+              <w:rPr>
+                <w:rFonts w:ascii="Times New Roman" w:hAnsi="Times New Roman" w:eastAsia="Times New Roman"/>
+                <w:sz w:val="18"/>
+                <w:highlight w:val="yellow"/>
+              </w:rPr>
+              <w:t xml:space="preserve">SA/SA</w:t>
+            </w:r>
+          </w:p>
+        </w:tc>
+      </w:tr>
+    </w:tbl>
+    <w:p>
+      <w:pPr>
+        <w:spacing w:line="240" w:lineRule="auto" w:before="0" w:after="40"/>
+      </w:pPr>
+      <w:r>
+        <w:rPr>
+          <w:sz w:val="4"/>
+        </w:rPr>
+        <w:t xml:space="preserve"> </w:t>
+      </w:r>
+    </w:p>
+    <w:p>
+      <w:pPr>
         <w:pStyle w:val="IOP-CS-SubsectionHeading"/>
         <w:keepNext/>
         <w:keepLines/>
@@ -4830,8 +6146,1488 @@
       <w:r>
         <w:rPr>
           <w:rFonts w:ascii="Times New Roman" w:hAnsi="Times New Roman" w:eastAsia="Times New Roman"/>
-        </w:rPr>
-        <w:t>5.3. Matched-Field and Forcing Audit</w:t>
+          <w:highlight w:val="yellow"/>
+        </w:rPr>
+        <w:t xml:space="preserve">5.3. Paired Callback Calibration</w:t>
+      </w:r>
+    </w:p>
+    <w:p>
+      <w:pPr>
+        <w:pStyle w:val="IOP-CS-BodyText"/>
+      </w:pPr>
+      <w:r>
+        <w:rPr>
+          <w:rFonts w:ascii="Times New Roman" w:hAnsi="Times New Roman" w:eastAsia="Times New Roman"/>
+          <w:highlight w:val="yellow"/>
+        </w:rPr>
+        <w:t xml:space="preserve">A prospective calibration covers constant, inclusion and checkerboard conductivity (contrast 100 for the latter two), N = 64, 128, 256, three methods, two callback modes and seven repeats: 378 recorded solves. Each repeat shuffles all 54 jobs; each solve constructs a fresh preconditioner with a seed matched across callback modes. Every run satisfies the independent residual threshold of 1e-8. All 189 paired solutions have identical byte hashes and iteration counts. Median paired monitored/count-only solve-time ratios range from 1.54 to 1.84 for CG, 1.58 to 1.77 for Jacobi-PCG, and 1.03 to 1.06 for AMG-PCG. These method-dependent penalties change reported speedups even when the median winner is unchanged.</w:t>
+      </w:r>
+    </w:p>
+    <w:p>
+      <w:pPr>
+        <w:pStyle w:val="IOP-CS-BodyText"/>
+      </w:pPr>
+      <w:r>
+        <w:rPr>
+          <w:rFonts w:ascii="Times New Roman" w:hAnsi="Times New Roman" w:eastAsia="Times New Roman"/>
+          <w:highlight w:val="yellow"/>
+        </w:rPr>
+        <w:t xml:space="preserve">Table 7 reports every case-size cell, including vote instability. The median winner agrees between callbacks in all nine cells. At constant N = 256, however, count-only AMG wins only three of seven repeats despite having the lowest method median; the median winner and majority vote answer different questions. The archived method summaries retain setup, solve and total-time quartiles for all candidates. Several N = 128 winners differ from the historical map under both callback modes, so callback removal alone cannot explain the historical-to-calibration difference. No universal N = 128 AMG crossover is inferred. The calibration does not measure cold-import overhead or control operating-system, power or thermal variation.</w:t>
+      </w:r>
+    </w:p>
+    <w:p>
+      <w:pPr>
+        <w:pStyle w:val="IOP-CS-CaptionText"/>
+        <w:keepNext/>
+        <w:keepLines/>
+      </w:pPr>
+      <w:r>
+        <w:rPr>
+          <w:rFonts w:ascii="Times New Roman" w:hAnsi="Times New Roman" w:eastAsia="Times New Roman"/>
+          <w:highlight w:val="yellow"/>
+        </w:rPr>
+        <w:t xml:space="preserve">Table 7. Paired callback calibration. Winner entries give method, median total milliseconds and votes out of seven. Last columns give median paired monitored/count-only solve-time ratios. J = Jacobi-PCG; SA = AMG-PCG.</w:t>
+      </w:r>
+    </w:p>
+    <w:tbl>
+      <w:tblPr>
+        <w:tblStyle w:val="TableGrid"/>
+        <w:tblW w:type="auto" w:w="0"/>
+        <w:tblLayout w:type="fixed"/>
+        <w:tblLook w:firstColumn="1" w:firstRow="1" w:lastColumn="0" w:lastRow="0" w:noHBand="0" w:noVBand="1" w:val="04A0"/>
+      </w:tblPr>
+      <w:tblGrid>
+        <w:gridCol w:w="1483"/>
+        <w:gridCol w:w="605"/>
+        <w:gridCol w:w="2117"/>
+        <w:gridCol w:w="2117"/>
+        <w:gridCol w:w="893"/>
+        <w:gridCol w:w="893"/>
+        <w:gridCol w:w="893"/>
+      </w:tblGrid>
+      <w:tr>
+        <w:trPr>
+          <w:tblHeader/>
+        </w:trPr>
+        <w:tc>
+          <w:tcPr>
+            <w:tcW w:type="dxa" w:w="1483"/>
+          </w:tcPr>
+          <w:p>
+            <w:pPr>
+              <w:keepNext/>
+              <w:keepLines/>
+            </w:pPr>
+            <w:r>
+              <w:rPr>
+                <w:rFonts w:ascii="Times New Roman" w:hAnsi="Times New Roman" w:eastAsia="Times New Roman"/>
+                <w:b/>
+                <w:sz w:val="18"/>
+                <w:highlight w:val="yellow"/>
+              </w:rPr>
+              <w:t xml:space="preserve">Case</w:t>
+            </w:r>
+          </w:p>
+        </w:tc>
+        <w:tc>
+          <w:tcPr>
+            <w:tcW w:type="dxa" w:w="605"/>
+          </w:tcPr>
+          <w:p>
+            <w:pPr>
+              <w:keepNext/>
+              <w:keepLines/>
+            </w:pPr>
+            <w:r>
+              <w:rPr>
+                <w:rFonts w:ascii="Times New Roman" w:hAnsi="Times New Roman" w:eastAsia="Times New Roman"/>
+                <w:b/>
+                <w:sz w:val="18"/>
+                <w:highlight w:val="yellow"/>
+              </w:rPr>
+              <w:t xml:space="preserve">N</w:t>
+            </w:r>
+          </w:p>
+        </w:tc>
+        <w:tc>
+          <w:tcPr>
+            <w:tcW w:type="dxa" w:w="2117"/>
+          </w:tcPr>
+          <w:p>
+            <w:pPr>
+              <w:keepNext/>
+              <w:keepLines/>
+            </w:pPr>
+            <w:r>
+              <w:rPr>
+                <w:rFonts w:ascii="Times New Roman" w:hAnsi="Times New Roman" w:eastAsia="Times New Roman"/>
+                <w:b/>
+                <w:sz w:val="18"/>
+                <w:highlight w:val="yellow"/>
+              </w:rPr>
+              <w:t xml:space="preserve">Monitored</w:t>
+            </w:r>
+          </w:p>
+        </w:tc>
+        <w:tc>
+          <w:tcPr>
+            <w:tcW w:type="dxa" w:w="2117"/>
+          </w:tcPr>
+          <w:p>
+            <w:pPr>
+              <w:keepNext/>
+              <w:keepLines/>
+            </w:pPr>
+            <w:r>
+              <w:rPr>
+                <w:rFonts w:ascii="Times New Roman" w:hAnsi="Times New Roman" w:eastAsia="Times New Roman"/>
+                <w:b/>
+                <w:sz w:val="18"/>
+                <w:highlight w:val="yellow"/>
+              </w:rPr>
+              <w:t xml:space="preserve">Count-only</w:t>
+            </w:r>
+          </w:p>
+        </w:tc>
+        <w:tc>
+          <w:tcPr>
+            <w:tcW w:type="dxa" w:w="893"/>
+          </w:tcPr>
+          <w:p>
+            <w:pPr>
+              <w:keepNext/>
+              <w:keepLines/>
+            </w:pPr>
+            <w:r>
+              <w:rPr>
+                <w:rFonts w:ascii="Times New Roman" w:hAnsi="Times New Roman" w:eastAsia="Times New Roman"/>
+                <w:b/>
+                <w:sz w:val="18"/>
+                <w:highlight w:val="yellow"/>
+              </w:rPr>
+              <w:t xml:space="preserve">CG</w:t>
+            </w:r>
+          </w:p>
+        </w:tc>
+        <w:tc>
+          <w:tcPr>
+            <w:tcW w:type="dxa" w:w="893"/>
+          </w:tcPr>
+          <w:p>
+            <w:pPr>
+              <w:keepNext/>
+              <w:keepLines/>
+            </w:pPr>
+            <w:r>
+              <w:rPr>
+                <w:rFonts w:ascii="Times New Roman" w:hAnsi="Times New Roman" w:eastAsia="Times New Roman"/>
+                <w:b/>
+                <w:sz w:val="18"/>
+                <w:highlight w:val="yellow"/>
+              </w:rPr>
+              <w:t xml:space="preserve">J</w:t>
+            </w:r>
+          </w:p>
+        </w:tc>
+        <w:tc>
+          <w:tcPr>
+            <w:tcW w:type="dxa" w:w="893"/>
+          </w:tcPr>
+          <w:p>
+            <w:pPr>
+              <w:keepNext/>
+              <w:keepLines/>
+            </w:pPr>
+            <w:r>
+              <w:rPr>
+                <w:rFonts w:ascii="Times New Roman" w:hAnsi="Times New Roman" w:eastAsia="Times New Roman"/>
+                <w:b/>
+                <w:sz w:val="18"/>
+                <w:highlight w:val="yellow"/>
+              </w:rPr>
+              <w:t xml:space="preserve">SA</w:t>
+            </w:r>
+          </w:p>
+        </w:tc>
+      </w:tr>
+      <w:tr>
+        <w:trPr>
+          <w:cantSplit/>
+        </w:trPr>
+        <w:tc>
+          <w:tcPr>
+            <w:tcW w:type="dxa" w:w="1483"/>
+          </w:tcPr>
+          <w:p>
+            <w:pPr>
+              <w:keepNext/>
+              <w:keepLines/>
+            </w:pPr>
+            <w:r>
+              <w:rPr>
+                <w:rFonts w:ascii="Times New Roman" w:hAnsi="Times New Roman" w:eastAsia="Times New Roman"/>
+                <w:sz w:val="18"/>
+                <w:highlight w:val="yellow"/>
+              </w:rPr>
+              <w:t xml:space="preserve">Constant</w:t>
+            </w:r>
+          </w:p>
+        </w:tc>
+        <w:tc>
+          <w:tcPr>
+            <w:tcW w:type="dxa" w:w="605"/>
+          </w:tcPr>
+          <w:p>
+            <w:pPr>
+              <w:keepNext/>
+              <w:keepLines/>
+            </w:pPr>
+            <w:r>
+              <w:rPr>
+                <w:rFonts w:ascii="Times New Roman" w:hAnsi="Times New Roman" w:eastAsia="Times New Roman"/>
+                <w:sz w:val="18"/>
+                <w:highlight w:val="yellow"/>
+              </w:rPr>
+              <w:t xml:space="preserve">64</w:t>
+            </w:r>
+          </w:p>
+        </w:tc>
+        <w:tc>
+          <w:tcPr>
+            <w:tcW w:type="dxa" w:w="2117"/>
+          </w:tcPr>
+          <w:p>
+            <w:pPr>
+              <w:keepNext/>
+              <w:keepLines/>
+            </w:pPr>
+            <w:r>
+              <w:rPr>
+                <w:rFonts w:ascii="Times New Roman" w:hAnsi="Times New Roman" w:eastAsia="Times New Roman"/>
+                <w:sz w:val="18"/>
+                <w:highlight w:val="yellow"/>
+              </w:rPr>
+              <w:t xml:space="preserve">CG 5.64 (7/7)</w:t>
+            </w:r>
+          </w:p>
+        </w:tc>
+        <w:tc>
+          <w:tcPr>
+            <w:tcW w:type="dxa" w:w="2117"/>
+          </w:tcPr>
+          <w:p>
+            <w:pPr>
+              <w:keepNext/>
+              <w:keepLines/>
+            </w:pPr>
+            <w:r>
+              <w:rPr>
+                <w:rFonts w:ascii="Times New Roman" w:hAnsi="Times New Roman" w:eastAsia="Times New Roman"/>
+                <w:sz w:val="18"/>
+                <w:highlight w:val="yellow"/>
+              </w:rPr>
+              <w:t xml:space="preserve">CG 3.55 (5/7)</w:t>
+            </w:r>
+          </w:p>
+        </w:tc>
+        <w:tc>
+          <w:tcPr>
+            <w:tcW w:type="dxa" w:w="893"/>
+          </w:tcPr>
+          <w:p>
+            <w:pPr>
+              <w:keepNext/>
+              <w:keepLines/>
+            </w:pPr>
+            <w:r>
+              <w:rPr>
+                <w:rFonts w:ascii="Times New Roman" w:hAnsi="Times New Roman" w:eastAsia="Times New Roman"/>
+                <w:sz w:val="18"/>
+                <w:highlight w:val="yellow"/>
+              </w:rPr>
+              <w:t xml:space="preserve">1.58</w:t>
+            </w:r>
+          </w:p>
+        </w:tc>
+        <w:tc>
+          <w:tcPr>
+            <w:tcW w:type="dxa" w:w="893"/>
+          </w:tcPr>
+          <w:p>
+            <w:pPr>
+              <w:keepNext/>
+              <w:keepLines/>
+            </w:pPr>
+            <w:r>
+              <w:rPr>
+                <w:rFonts w:ascii="Times New Roman" w:hAnsi="Times New Roman" w:eastAsia="Times New Roman"/>
+                <w:sz w:val="18"/>
+                <w:highlight w:val="yellow"/>
+              </w:rPr>
+              <w:t xml:space="preserve">1.58</w:t>
+            </w:r>
+          </w:p>
+        </w:tc>
+        <w:tc>
+          <w:tcPr>
+            <w:tcW w:type="dxa" w:w="893"/>
+          </w:tcPr>
+          <w:p>
+            <w:pPr>
+              <w:keepNext/>
+              <w:keepLines/>
+            </w:pPr>
+            <w:r>
+              <w:rPr>
+                <w:rFonts w:ascii="Times New Roman" w:hAnsi="Times New Roman" w:eastAsia="Times New Roman"/>
+                <w:sz w:val="18"/>
+                <w:highlight w:val="yellow"/>
+              </w:rPr>
+              <w:t xml:space="preserve">1.05</w:t>
+            </w:r>
+          </w:p>
+        </w:tc>
+      </w:tr>
+      <w:tr>
+        <w:trPr>
+          <w:cantSplit/>
+        </w:trPr>
+        <w:tc>
+          <w:tcPr>
+            <w:tcW w:type="dxa" w:w="1483"/>
+          </w:tcPr>
+          <w:p>
+            <w:pPr>
+              <w:keepNext/>
+              <w:keepLines/>
+            </w:pPr>
+            <w:r>
+              <w:rPr>
+                <w:rFonts w:ascii="Times New Roman" w:hAnsi="Times New Roman" w:eastAsia="Times New Roman"/>
+                <w:sz w:val="18"/>
+                <w:highlight w:val="yellow"/>
+              </w:rPr>
+              <w:t xml:space="preserve">Constant</w:t>
+            </w:r>
+          </w:p>
+        </w:tc>
+        <w:tc>
+          <w:tcPr>
+            <w:tcW w:type="dxa" w:w="605"/>
+          </w:tcPr>
+          <w:p>
+            <w:pPr>
+              <w:keepNext/>
+              <w:keepLines/>
+            </w:pPr>
+            <w:r>
+              <w:rPr>
+                <w:rFonts w:ascii="Times New Roman" w:hAnsi="Times New Roman" w:eastAsia="Times New Roman"/>
+                <w:sz w:val="18"/>
+                <w:highlight w:val="yellow"/>
+              </w:rPr>
+              <w:t xml:space="preserve">128</w:t>
+            </w:r>
+          </w:p>
+        </w:tc>
+        <w:tc>
+          <w:tcPr>
+            <w:tcW w:type="dxa" w:w="2117"/>
+          </w:tcPr>
+          <w:p>
+            <w:pPr>
+              <w:keepNext/>
+              <w:keepLines/>
+            </w:pPr>
+            <w:r>
+              <w:rPr>
+                <w:rFonts w:ascii="Times New Roman" w:hAnsi="Times New Roman" w:eastAsia="Times New Roman"/>
+                <w:sz w:val="18"/>
+                <w:highlight w:val="yellow"/>
+              </w:rPr>
+              <w:t xml:space="preserve">CG 31.22 (6/7)</w:t>
+            </w:r>
+          </w:p>
+        </w:tc>
+        <w:tc>
+          <w:tcPr>
+            <w:tcW w:type="dxa" w:w="2117"/>
+          </w:tcPr>
+          <w:p>
+            <w:pPr>
+              <w:keepNext/>
+              <w:keepLines/>
+            </w:pPr>
+            <w:r>
+              <w:rPr>
+                <w:rFonts w:ascii="Times New Roman" w:hAnsi="Times New Roman" w:eastAsia="Times New Roman"/>
+                <w:sz w:val="18"/>
+                <w:highlight w:val="yellow"/>
+              </w:rPr>
+              <w:t xml:space="preserve">CG 19.11 (7/7)</w:t>
+            </w:r>
+          </w:p>
+        </w:tc>
+        <w:tc>
+          <w:tcPr>
+            <w:tcW w:type="dxa" w:w="893"/>
+          </w:tcPr>
+          <w:p>
+            <w:pPr>
+              <w:keepNext/>
+              <w:keepLines/>
+            </w:pPr>
+            <w:r>
+              <w:rPr>
+                <w:rFonts w:ascii="Times New Roman" w:hAnsi="Times New Roman" w:eastAsia="Times New Roman"/>
+                <w:sz w:val="18"/>
+                <w:highlight w:val="yellow"/>
+              </w:rPr>
+              <w:t xml:space="preserve">1.67</w:t>
+            </w:r>
+          </w:p>
+        </w:tc>
+        <w:tc>
+          <w:tcPr>
+            <w:tcW w:type="dxa" w:w="893"/>
+          </w:tcPr>
+          <w:p>
+            <w:pPr>
+              <w:keepNext/>
+              <w:keepLines/>
+            </w:pPr>
+            <w:r>
+              <w:rPr>
+                <w:rFonts w:ascii="Times New Roman" w:hAnsi="Times New Roman" w:eastAsia="Times New Roman"/>
+                <w:sz w:val="18"/>
+                <w:highlight w:val="yellow"/>
+              </w:rPr>
+              <w:t xml:space="preserve">1.70</w:t>
+            </w:r>
+          </w:p>
+        </w:tc>
+        <w:tc>
+          <w:tcPr>
+            <w:tcW w:type="dxa" w:w="893"/>
+          </w:tcPr>
+          <w:p>
+            <w:pPr>
+              <w:keepNext/>
+              <w:keepLines/>
+            </w:pPr>
+            <w:r>
+              <w:rPr>
+                <w:rFonts w:ascii="Times New Roman" w:hAnsi="Times New Roman" w:eastAsia="Times New Roman"/>
+                <w:sz w:val="18"/>
+                <w:highlight w:val="yellow"/>
+              </w:rPr>
+              <w:t xml:space="preserve">1.04</w:t>
+            </w:r>
+          </w:p>
+        </w:tc>
+      </w:tr>
+      <w:tr>
+        <w:trPr>
+          <w:cantSplit/>
+        </w:trPr>
+        <w:tc>
+          <w:tcPr>
+            <w:tcW w:type="dxa" w:w="1483"/>
+          </w:tcPr>
+          <w:p>
+            <w:pPr>
+              <w:keepNext/>
+              <w:keepLines/>
+            </w:pPr>
+            <w:r>
+              <w:rPr>
+                <w:rFonts w:ascii="Times New Roman" w:hAnsi="Times New Roman" w:eastAsia="Times New Roman"/>
+                <w:sz w:val="18"/>
+                <w:highlight w:val="yellow"/>
+              </w:rPr>
+              <w:t xml:space="preserve">Constant</w:t>
+            </w:r>
+          </w:p>
+        </w:tc>
+        <w:tc>
+          <w:tcPr>
+            <w:tcW w:type="dxa" w:w="605"/>
+          </w:tcPr>
+          <w:p>
+            <w:pPr>
+              <w:keepNext/>
+              <w:keepLines/>
+            </w:pPr>
+            <w:r>
+              <w:rPr>
+                <w:rFonts w:ascii="Times New Roman" w:hAnsi="Times New Roman" w:eastAsia="Times New Roman"/>
+                <w:sz w:val="18"/>
+                <w:highlight w:val="yellow"/>
+              </w:rPr>
+              <w:t xml:space="preserve">256</w:t>
+            </w:r>
+          </w:p>
+        </w:tc>
+        <w:tc>
+          <w:tcPr>
+            <w:tcW w:type="dxa" w:w="2117"/>
+          </w:tcPr>
+          <w:p>
+            <w:pPr>
+              <w:keepNext/>
+              <w:keepLines/>
+            </w:pPr>
+            <w:r>
+              <w:rPr>
+                <w:rFonts w:ascii="Times New Roman" w:hAnsi="Times New Roman" w:eastAsia="Times New Roman"/>
+                <w:sz w:val="18"/>
+                <w:highlight w:val="yellow"/>
+              </w:rPr>
+              <w:t xml:space="preserve">SA 141.18 (7/7)</w:t>
+            </w:r>
+          </w:p>
+        </w:tc>
+        <w:tc>
+          <w:tcPr>
+            <w:tcW w:type="dxa" w:w="2117"/>
+          </w:tcPr>
+          <w:p>
+            <w:pPr>
+              <w:keepNext/>
+              <w:keepLines/>
+            </w:pPr>
+            <w:r>
+              <w:rPr>
+                <w:rFonts w:ascii="Times New Roman" w:hAnsi="Times New Roman" w:eastAsia="Times New Roman"/>
+                <w:sz w:val="18"/>
+                <w:highlight w:val="yellow"/>
+              </w:rPr>
+              <w:t xml:space="preserve">SA 147.70 (3/7)</w:t>
+            </w:r>
+          </w:p>
+        </w:tc>
+        <w:tc>
+          <w:tcPr>
+            <w:tcW w:type="dxa" w:w="893"/>
+          </w:tcPr>
+          <w:p>
+            <w:pPr>
+              <w:keepNext/>
+              <w:keepLines/>
+            </w:pPr>
+            <w:r>
+              <w:rPr>
+                <w:rFonts w:ascii="Times New Roman" w:hAnsi="Times New Roman" w:eastAsia="Times New Roman"/>
+                <w:sz w:val="18"/>
+                <w:highlight w:val="yellow"/>
+              </w:rPr>
+              <w:t xml:space="preserve">1.84</w:t>
+            </w:r>
+          </w:p>
+        </w:tc>
+        <w:tc>
+          <w:tcPr>
+            <w:tcW w:type="dxa" w:w="893"/>
+          </w:tcPr>
+          <w:p>
+            <w:pPr>
+              <w:keepNext/>
+              <w:keepLines/>
+            </w:pPr>
+            <w:r>
+              <w:rPr>
+                <w:rFonts w:ascii="Times New Roman" w:hAnsi="Times New Roman" w:eastAsia="Times New Roman"/>
+                <w:sz w:val="18"/>
+                <w:highlight w:val="yellow"/>
+              </w:rPr>
+              <w:t xml:space="preserve">1.76</w:t>
+            </w:r>
+          </w:p>
+        </w:tc>
+        <w:tc>
+          <w:tcPr>
+            <w:tcW w:type="dxa" w:w="893"/>
+          </w:tcPr>
+          <w:p>
+            <w:pPr>
+              <w:keepNext/>
+              <w:keepLines/>
+            </w:pPr>
+            <w:r>
+              <w:rPr>
+                <w:rFonts w:ascii="Times New Roman" w:hAnsi="Times New Roman" w:eastAsia="Times New Roman"/>
+                <w:sz w:val="18"/>
+                <w:highlight w:val="yellow"/>
+              </w:rPr>
+              <w:t xml:space="preserve">1.04</w:t>
+            </w:r>
+          </w:p>
+        </w:tc>
+      </w:tr>
+      <w:tr>
+        <w:trPr>
+          <w:cantSplit/>
+        </w:trPr>
+        <w:tc>
+          <w:tcPr>
+            <w:tcW w:type="dxa" w:w="1483"/>
+          </w:tcPr>
+          <w:p>
+            <w:pPr>
+              <w:keepNext/>
+              <w:keepLines/>
+            </w:pPr>
+            <w:r>
+              <w:rPr>
+                <w:rFonts w:ascii="Times New Roman" w:hAnsi="Times New Roman" w:eastAsia="Times New Roman"/>
+                <w:sz w:val="18"/>
+                <w:highlight w:val="yellow"/>
+              </w:rPr>
+              <w:t xml:space="preserve">Inclusion</w:t>
+            </w:r>
+          </w:p>
+        </w:tc>
+        <w:tc>
+          <w:tcPr>
+            <w:tcW w:type="dxa" w:w="605"/>
+          </w:tcPr>
+          <w:p>
+            <w:pPr>
+              <w:keepNext/>
+              <w:keepLines/>
+            </w:pPr>
+            <w:r>
+              <w:rPr>
+                <w:rFonts w:ascii="Times New Roman" w:hAnsi="Times New Roman" w:eastAsia="Times New Roman"/>
+                <w:sz w:val="18"/>
+                <w:highlight w:val="yellow"/>
+              </w:rPr>
+              <w:t xml:space="preserve">64</w:t>
+            </w:r>
+          </w:p>
+        </w:tc>
+        <w:tc>
+          <w:tcPr>
+            <w:tcW w:type="dxa" w:w="2117"/>
+          </w:tcPr>
+          <w:p>
+            <w:pPr>
+              <w:keepNext/>
+              <w:keepLines/>
+            </w:pPr>
+            <w:r>
+              <w:rPr>
+                <w:rFonts w:ascii="Times New Roman" w:hAnsi="Times New Roman" w:eastAsia="Times New Roman"/>
+                <w:sz w:val="18"/>
+                <w:highlight w:val="yellow"/>
+              </w:rPr>
+              <w:t xml:space="preserve">J 6.67 (7/7)</w:t>
+            </w:r>
+          </w:p>
+        </w:tc>
+        <w:tc>
+          <w:tcPr>
+            <w:tcW w:type="dxa" w:w="2117"/>
+          </w:tcPr>
+          <w:p>
+            <w:pPr>
+              <w:keepNext/>
+              <w:keepLines/>
+            </w:pPr>
+            <w:r>
+              <w:rPr>
+                <w:rFonts w:ascii="Times New Roman" w:hAnsi="Times New Roman" w:eastAsia="Times New Roman"/>
+                <w:sz w:val="18"/>
+                <w:highlight w:val="yellow"/>
+              </w:rPr>
+              <w:t xml:space="preserve">J 4.12 (7/7)</w:t>
+            </w:r>
+          </w:p>
+        </w:tc>
+        <w:tc>
+          <w:tcPr>
+            <w:tcW w:type="dxa" w:w="893"/>
+          </w:tcPr>
+          <w:p>
+            <w:pPr>
+              <w:keepNext/>
+              <w:keepLines/>
+            </w:pPr>
+            <w:r>
+              <w:rPr>
+                <w:rFonts w:ascii="Times New Roman" w:hAnsi="Times New Roman" w:eastAsia="Times New Roman"/>
+                <w:sz w:val="18"/>
+                <w:highlight w:val="yellow"/>
+              </w:rPr>
+              <w:t xml:space="preserve">1.63</w:t>
+            </w:r>
+          </w:p>
+        </w:tc>
+        <w:tc>
+          <w:tcPr>
+            <w:tcW w:type="dxa" w:w="893"/>
+          </w:tcPr>
+          <w:p>
+            <w:pPr>
+              <w:keepNext/>
+              <w:keepLines/>
+            </w:pPr>
+            <w:r>
+              <w:rPr>
+                <w:rFonts w:ascii="Times New Roman" w:hAnsi="Times New Roman" w:eastAsia="Times New Roman"/>
+                <w:sz w:val="18"/>
+                <w:highlight w:val="yellow"/>
+              </w:rPr>
+              <w:t xml:space="preserve">1.62</w:t>
+            </w:r>
+          </w:p>
+        </w:tc>
+        <w:tc>
+          <w:tcPr>
+            <w:tcW w:type="dxa" w:w="893"/>
+          </w:tcPr>
+          <w:p>
+            <w:pPr>
+              <w:keepNext/>
+              <w:keepLines/>
+            </w:pPr>
+            <w:r>
+              <w:rPr>
+                <w:rFonts w:ascii="Times New Roman" w:hAnsi="Times New Roman" w:eastAsia="Times New Roman"/>
+                <w:sz w:val="18"/>
+                <w:highlight w:val="yellow"/>
+              </w:rPr>
+              <w:t xml:space="preserve">1.03</w:t>
+            </w:r>
+          </w:p>
+        </w:tc>
+      </w:tr>
+      <w:tr>
+        <w:trPr>
+          <w:cantSplit/>
+        </w:trPr>
+        <w:tc>
+          <w:tcPr>
+            <w:tcW w:type="dxa" w:w="1483"/>
+          </w:tcPr>
+          <w:p>
+            <w:pPr>
+              <w:keepNext/>
+              <w:keepLines/>
+            </w:pPr>
+            <w:r>
+              <w:rPr>
+                <w:rFonts w:ascii="Times New Roman" w:hAnsi="Times New Roman" w:eastAsia="Times New Roman"/>
+                <w:sz w:val="18"/>
+                <w:highlight w:val="yellow"/>
+              </w:rPr>
+              <w:t xml:space="preserve">Inclusion</w:t>
+            </w:r>
+          </w:p>
+        </w:tc>
+        <w:tc>
+          <w:tcPr>
+            <w:tcW w:type="dxa" w:w="605"/>
+          </w:tcPr>
+          <w:p>
+            <w:pPr>
+              <w:keepNext/>
+              <w:keepLines/>
+            </w:pPr>
+            <w:r>
+              <w:rPr>
+                <w:rFonts w:ascii="Times New Roman" w:hAnsi="Times New Roman" w:eastAsia="Times New Roman"/>
+                <w:sz w:val="18"/>
+                <w:highlight w:val="yellow"/>
+              </w:rPr>
+              <w:t xml:space="preserve">128</w:t>
+            </w:r>
+          </w:p>
+        </w:tc>
+        <w:tc>
+          <w:tcPr>
+            <w:tcW w:type="dxa" w:w="2117"/>
+          </w:tcPr>
+          <w:p>
+            <w:pPr>
+              <w:keepNext/>
+              <w:keepLines/>
+            </w:pPr>
+            <w:r>
+              <w:rPr>
+                <w:rFonts w:ascii="Times New Roman" w:hAnsi="Times New Roman" w:eastAsia="Times New Roman"/>
+                <w:sz w:val="18"/>
+                <w:highlight w:val="yellow"/>
+              </w:rPr>
+              <w:t xml:space="preserve">J 38.28 (7/7)</w:t>
+            </w:r>
+          </w:p>
+        </w:tc>
+        <w:tc>
+          <w:tcPr>
+            <w:tcW w:type="dxa" w:w="2117"/>
+          </w:tcPr>
+          <w:p>
+            <w:pPr>
+              <w:keepNext/>
+              <w:keepLines/>
+            </w:pPr>
+            <w:r>
+              <w:rPr>
+                <w:rFonts w:ascii="Times New Roman" w:hAnsi="Times New Roman" w:eastAsia="Times New Roman"/>
+                <w:sz w:val="18"/>
+                <w:highlight w:val="yellow"/>
+              </w:rPr>
+              <w:t xml:space="preserve">J 22.34 (7/7)</w:t>
+            </w:r>
+          </w:p>
+        </w:tc>
+        <w:tc>
+          <w:tcPr>
+            <w:tcW w:type="dxa" w:w="893"/>
+          </w:tcPr>
+          <w:p>
+            <w:pPr>
+              <w:keepNext/>
+              <w:keepLines/>
+            </w:pPr>
+            <w:r>
+              <w:rPr>
+                <w:rFonts w:ascii="Times New Roman" w:hAnsi="Times New Roman" w:eastAsia="Times New Roman"/>
+                <w:sz w:val="18"/>
+                <w:highlight w:val="yellow"/>
+              </w:rPr>
+              <w:t xml:space="preserve">1.72</w:t>
+            </w:r>
+          </w:p>
+        </w:tc>
+        <w:tc>
+          <w:tcPr>
+            <w:tcW w:type="dxa" w:w="893"/>
+          </w:tcPr>
+          <w:p>
+            <w:pPr>
+              <w:keepNext/>
+              <w:keepLines/>
+            </w:pPr>
+            <w:r>
+              <w:rPr>
+                <w:rFonts w:ascii="Times New Roman" w:hAnsi="Times New Roman" w:eastAsia="Times New Roman"/>
+                <w:sz w:val="18"/>
+                <w:highlight w:val="yellow"/>
+              </w:rPr>
+              <w:t xml:space="preserve">1.61</w:t>
+            </w:r>
+          </w:p>
+        </w:tc>
+        <w:tc>
+          <w:tcPr>
+            <w:tcW w:type="dxa" w:w="893"/>
+          </w:tcPr>
+          <w:p>
+            <w:pPr>
+              <w:keepNext/>
+              <w:keepLines/>
+            </w:pPr>
+            <w:r>
+              <w:rPr>
+                <w:rFonts w:ascii="Times New Roman" w:hAnsi="Times New Roman" w:eastAsia="Times New Roman"/>
+                <w:sz w:val="18"/>
+                <w:highlight w:val="yellow"/>
+              </w:rPr>
+              <w:t xml:space="preserve">1.04</w:t>
+            </w:r>
+          </w:p>
+        </w:tc>
+      </w:tr>
+      <w:tr>
+        <w:trPr>
+          <w:cantSplit/>
+        </w:trPr>
+        <w:tc>
+          <w:tcPr>
+            <w:tcW w:type="dxa" w:w="1483"/>
+          </w:tcPr>
+          <w:p>
+            <w:pPr>
+              <w:keepNext/>
+              <w:keepLines/>
+            </w:pPr>
+            <w:r>
+              <w:rPr>
+                <w:rFonts w:ascii="Times New Roman" w:hAnsi="Times New Roman" w:eastAsia="Times New Roman"/>
+                <w:sz w:val="18"/>
+                <w:highlight w:val="yellow"/>
+              </w:rPr>
+              <w:t xml:space="preserve">Inclusion</w:t>
+            </w:r>
+          </w:p>
+        </w:tc>
+        <w:tc>
+          <w:tcPr>
+            <w:tcW w:type="dxa" w:w="605"/>
+          </w:tcPr>
+          <w:p>
+            <w:pPr>
+              <w:keepNext/>
+              <w:keepLines/>
+            </w:pPr>
+            <w:r>
+              <w:rPr>
+                <w:rFonts w:ascii="Times New Roman" w:hAnsi="Times New Roman" w:eastAsia="Times New Roman"/>
+                <w:sz w:val="18"/>
+                <w:highlight w:val="yellow"/>
+              </w:rPr>
+              <w:t xml:space="preserve">256</w:t>
+            </w:r>
+          </w:p>
+        </w:tc>
+        <w:tc>
+          <w:tcPr>
+            <w:tcW w:type="dxa" w:w="2117"/>
+          </w:tcPr>
+          <w:p>
+            <w:pPr>
+              <w:keepNext/>
+              <w:keepLines/>
+            </w:pPr>
+            <w:r>
+              <w:rPr>
+                <w:rFonts w:ascii="Times New Roman" w:hAnsi="Times New Roman" w:eastAsia="Times New Roman"/>
+                <w:sz w:val="18"/>
+                <w:highlight w:val="yellow"/>
+              </w:rPr>
+              <w:t xml:space="preserve">SA 156.23 (7/7)</w:t>
+            </w:r>
+          </w:p>
+        </w:tc>
+        <w:tc>
+          <w:tcPr>
+            <w:tcW w:type="dxa" w:w="2117"/>
+          </w:tcPr>
+          <w:p>
+            <w:pPr>
+              <w:keepNext/>
+              <w:keepLines/>
+            </w:pPr>
+            <w:r>
+              <w:rPr>
+                <w:rFonts w:ascii="Times New Roman" w:hAnsi="Times New Roman" w:eastAsia="Times New Roman"/>
+                <w:sz w:val="18"/>
+                <w:highlight w:val="yellow"/>
+              </w:rPr>
+              <w:t xml:space="preserve">SA 152.34 (6/7)</w:t>
+            </w:r>
+          </w:p>
+        </w:tc>
+        <w:tc>
+          <w:tcPr>
+            <w:tcW w:type="dxa" w:w="893"/>
+          </w:tcPr>
+          <w:p>
+            <w:pPr>
+              <w:keepNext/>
+              <w:keepLines/>
+            </w:pPr>
+            <w:r>
+              <w:rPr>
+                <w:rFonts w:ascii="Times New Roman" w:hAnsi="Times New Roman" w:eastAsia="Times New Roman"/>
+                <w:sz w:val="18"/>
+                <w:highlight w:val="yellow"/>
+              </w:rPr>
+              <w:t xml:space="preserve">1.79</w:t>
+            </w:r>
+          </w:p>
+        </w:tc>
+        <w:tc>
+          <w:tcPr>
+            <w:tcW w:type="dxa" w:w="893"/>
+          </w:tcPr>
+          <w:p>
+            <w:pPr>
+              <w:keepNext/>
+              <w:keepLines/>
+            </w:pPr>
+            <w:r>
+              <w:rPr>
+                <w:rFonts w:ascii="Times New Roman" w:hAnsi="Times New Roman" w:eastAsia="Times New Roman"/>
+                <w:sz w:val="18"/>
+                <w:highlight w:val="yellow"/>
+              </w:rPr>
+              <w:t xml:space="preserve">1.77</w:t>
+            </w:r>
+          </w:p>
+        </w:tc>
+        <w:tc>
+          <w:tcPr>
+            <w:tcW w:type="dxa" w:w="893"/>
+          </w:tcPr>
+          <w:p>
+            <w:pPr>
+              <w:keepNext/>
+              <w:keepLines/>
+            </w:pPr>
+            <w:r>
+              <w:rPr>
+                <w:rFonts w:ascii="Times New Roman" w:hAnsi="Times New Roman" w:eastAsia="Times New Roman"/>
+                <w:sz w:val="18"/>
+                <w:highlight w:val="yellow"/>
+              </w:rPr>
+              <w:t xml:space="preserve">1.03</w:t>
+            </w:r>
+          </w:p>
+        </w:tc>
+      </w:tr>
+      <w:tr>
+        <w:trPr>
+          <w:cantSplit/>
+        </w:trPr>
+        <w:tc>
+          <w:tcPr>
+            <w:tcW w:type="dxa" w:w="1483"/>
+          </w:tcPr>
+          <w:p>
+            <w:pPr>
+              <w:keepNext/>
+              <w:keepLines/>
+            </w:pPr>
+            <w:r>
+              <w:rPr>
+                <w:rFonts w:ascii="Times New Roman" w:hAnsi="Times New Roman" w:eastAsia="Times New Roman"/>
+                <w:sz w:val="18"/>
+                <w:highlight w:val="yellow"/>
+              </w:rPr>
+              <w:t xml:space="preserve">Checkerboard</w:t>
+            </w:r>
+          </w:p>
+        </w:tc>
+        <w:tc>
+          <w:tcPr>
+            <w:tcW w:type="dxa" w:w="605"/>
+          </w:tcPr>
+          <w:p>
+            <w:pPr>
+              <w:keepNext/>
+              <w:keepLines/>
+            </w:pPr>
+            <w:r>
+              <w:rPr>
+                <w:rFonts w:ascii="Times New Roman" w:hAnsi="Times New Roman" w:eastAsia="Times New Roman"/>
+                <w:sz w:val="18"/>
+                <w:highlight w:val="yellow"/>
+              </w:rPr>
+              <w:t xml:space="preserve">64</w:t>
+            </w:r>
+          </w:p>
+        </w:tc>
+        <w:tc>
+          <w:tcPr>
+            <w:tcW w:type="dxa" w:w="2117"/>
+          </w:tcPr>
+          <w:p>
+            <w:pPr>
+              <w:keepNext/>
+              <w:keepLines/>
+            </w:pPr>
+            <w:r>
+              <w:rPr>
+                <w:rFonts w:ascii="Times New Roman" w:hAnsi="Times New Roman" w:eastAsia="Times New Roman"/>
+                <w:sz w:val="18"/>
+                <w:highlight w:val="yellow"/>
+              </w:rPr>
+              <w:t xml:space="preserve">J 8.69 (6/7)</w:t>
+            </w:r>
+          </w:p>
+        </w:tc>
+        <w:tc>
+          <w:tcPr>
+            <w:tcW w:type="dxa" w:w="2117"/>
+          </w:tcPr>
+          <w:p>
+            <w:pPr>
+              <w:keepNext/>
+              <w:keepLines/>
+            </w:pPr>
+            <w:r>
+              <w:rPr>
+                <w:rFonts w:ascii="Times New Roman" w:hAnsi="Times New Roman" w:eastAsia="Times New Roman"/>
+                <w:sz w:val="18"/>
+                <w:highlight w:val="yellow"/>
+              </w:rPr>
+              <w:t xml:space="preserve">J 5.63 (7/7)</w:t>
+            </w:r>
+          </w:p>
+        </w:tc>
+        <w:tc>
+          <w:tcPr>
+            <w:tcW w:type="dxa" w:w="893"/>
+          </w:tcPr>
+          <w:p>
+            <w:pPr>
+              <w:keepNext/>
+              <w:keepLines/>
+            </w:pPr>
+            <w:r>
+              <w:rPr>
+                <w:rFonts w:ascii="Times New Roman" w:hAnsi="Times New Roman" w:eastAsia="Times New Roman"/>
+                <w:sz w:val="18"/>
+                <w:highlight w:val="yellow"/>
+              </w:rPr>
+              <w:t xml:space="preserve">1.54</w:t>
+            </w:r>
+          </w:p>
+        </w:tc>
+        <w:tc>
+          <w:tcPr>
+            <w:tcW w:type="dxa" w:w="893"/>
+          </w:tcPr>
+          <w:p>
+            <w:pPr>
+              <w:keepNext/>
+              <w:keepLines/>
+            </w:pPr>
+            <w:r>
+              <w:rPr>
+                <w:rFonts w:ascii="Times New Roman" w:hAnsi="Times New Roman" w:eastAsia="Times New Roman"/>
+                <w:sz w:val="18"/>
+                <w:highlight w:val="yellow"/>
+              </w:rPr>
+              <w:t xml:space="preserve">1.59</w:t>
+            </w:r>
+          </w:p>
+        </w:tc>
+        <w:tc>
+          <w:tcPr>
+            <w:tcW w:type="dxa" w:w="893"/>
+          </w:tcPr>
+          <w:p>
+            <w:pPr>
+              <w:keepNext/>
+              <w:keepLines/>
+            </w:pPr>
+            <w:r>
+              <w:rPr>
+                <w:rFonts w:ascii="Times New Roman" w:hAnsi="Times New Roman" w:eastAsia="Times New Roman"/>
+                <w:sz w:val="18"/>
+                <w:highlight w:val="yellow"/>
+              </w:rPr>
+              <w:t xml:space="preserve">1.04</w:t>
+            </w:r>
+          </w:p>
+        </w:tc>
+      </w:tr>
+      <w:tr>
+        <w:trPr>
+          <w:cantSplit/>
+        </w:trPr>
+        <w:tc>
+          <w:tcPr>
+            <w:tcW w:type="dxa" w:w="1483"/>
+          </w:tcPr>
+          <w:p>
+            <w:pPr>
+              <w:keepNext/>
+              <w:keepLines/>
+            </w:pPr>
+            <w:r>
+              <w:rPr>
+                <w:rFonts w:ascii="Times New Roman" w:hAnsi="Times New Roman" w:eastAsia="Times New Roman"/>
+                <w:sz w:val="18"/>
+                <w:highlight w:val="yellow"/>
+              </w:rPr>
+              <w:t xml:space="preserve">Checkerboard</w:t>
+            </w:r>
+          </w:p>
+        </w:tc>
+        <w:tc>
+          <w:tcPr>
+            <w:tcW w:type="dxa" w:w="605"/>
+          </w:tcPr>
+          <w:p>
+            <w:pPr>
+              <w:keepNext/>
+              <w:keepLines/>
+            </w:pPr>
+            <w:r>
+              <w:rPr>
+                <w:rFonts w:ascii="Times New Roman" w:hAnsi="Times New Roman" w:eastAsia="Times New Roman"/>
+                <w:sz w:val="18"/>
+                <w:highlight w:val="yellow"/>
+              </w:rPr>
+              <w:t xml:space="preserve">128</w:t>
+            </w:r>
+          </w:p>
+        </w:tc>
+        <w:tc>
+          <w:tcPr>
+            <w:tcW w:type="dxa" w:w="2117"/>
+          </w:tcPr>
+          <w:p>
+            <w:pPr>
+              <w:keepNext/>
+              <w:keepLines/>
+            </w:pPr>
+            <w:r>
+              <w:rPr>
+                <w:rFonts w:ascii="Times New Roman" w:hAnsi="Times New Roman" w:eastAsia="Times New Roman"/>
+                <w:sz w:val="18"/>
+                <w:highlight w:val="yellow"/>
+              </w:rPr>
+              <w:t xml:space="preserve">J 50.18 (5/7)</w:t>
+            </w:r>
+          </w:p>
+        </w:tc>
+        <w:tc>
+          <w:tcPr>
+            <w:tcW w:type="dxa" w:w="2117"/>
+          </w:tcPr>
+          <w:p>
+            <w:pPr>
+              <w:keepNext/>
+              <w:keepLines/>
+            </w:pPr>
+            <w:r>
+              <w:rPr>
+                <w:rFonts w:ascii="Times New Roman" w:hAnsi="Times New Roman" w:eastAsia="Times New Roman"/>
+                <w:sz w:val="18"/>
+                <w:highlight w:val="yellow"/>
+              </w:rPr>
+              <w:t xml:space="preserve">J 29.65 (7/7)</w:t>
+            </w:r>
+          </w:p>
+        </w:tc>
+        <w:tc>
+          <w:tcPr>
+            <w:tcW w:type="dxa" w:w="893"/>
+          </w:tcPr>
+          <w:p>
+            <w:pPr>
+              <w:keepNext/>
+              <w:keepLines/>
+            </w:pPr>
+            <w:r>
+              <w:rPr>
+                <w:rFonts w:ascii="Times New Roman" w:hAnsi="Times New Roman" w:eastAsia="Times New Roman"/>
+                <w:sz w:val="18"/>
+                <w:highlight w:val="yellow"/>
+              </w:rPr>
+              <w:t xml:space="preserve">1.73</w:t>
+            </w:r>
+          </w:p>
+        </w:tc>
+        <w:tc>
+          <w:tcPr>
+            <w:tcW w:type="dxa" w:w="893"/>
+          </w:tcPr>
+          <w:p>
+            <w:pPr>
+              <w:keepNext/>
+              <w:keepLines/>
+            </w:pPr>
+            <w:r>
+              <w:rPr>
+                <w:rFonts w:ascii="Times New Roman" w:hAnsi="Times New Roman" w:eastAsia="Times New Roman"/>
+                <w:sz w:val="18"/>
+                <w:highlight w:val="yellow"/>
+              </w:rPr>
+              <w:t xml:space="preserve">1.65</w:t>
+            </w:r>
+          </w:p>
+        </w:tc>
+        <w:tc>
+          <w:tcPr>
+            <w:tcW w:type="dxa" w:w="893"/>
+          </w:tcPr>
+          <w:p>
+            <w:pPr>
+              <w:keepNext/>
+              <w:keepLines/>
+            </w:pPr>
+            <w:r>
+              <w:rPr>
+                <w:rFonts w:ascii="Times New Roman" w:hAnsi="Times New Roman" w:eastAsia="Times New Roman"/>
+                <w:sz w:val="18"/>
+                <w:highlight w:val="yellow"/>
+              </w:rPr>
+              <w:t xml:space="preserve">1.06</w:t>
+            </w:r>
+          </w:p>
+        </w:tc>
+      </w:tr>
+      <w:tr>
+        <w:trPr>
+          <w:cantSplit/>
+        </w:trPr>
+        <w:tc>
+          <w:tcPr>
+            <w:tcW w:type="dxa" w:w="1483"/>
+          </w:tcPr>
+          <w:p>
+            <w:pPr>
+              <w:keepNext w:val="0"/>
+              <w:keepLines/>
+            </w:pPr>
+            <w:r>
+              <w:rPr>
+                <w:rFonts w:ascii="Times New Roman" w:hAnsi="Times New Roman" w:eastAsia="Times New Roman"/>
+                <w:sz w:val="18"/>
+                <w:highlight w:val="yellow"/>
+              </w:rPr>
+              <w:t xml:space="preserve">Checkerboard</w:t>
+            </w:r>
+          </w:p>
+        </w:tc>
+        <w:tc>
+          <w:tcPr>
+            <w:tcW w:type="dxa" w:w="605"/>
+          </w:tcPr>
+          <w:p>
+            <w:pPr>
+              <w:keepNext w:val="0"/>
+              <w:keepLines/>
+            </w:pPr>
+            <w:r>
+              <w:rPr>
+                <w:rFonts w:ascii="Times New Roman" w:hAnsi="Times New Roman" w:eastAsia="Times New Roman"/>
+                <w:sz w:val="18"/>
+                <w:highlight w:val="yellow"/>
+              </w:rPr>
+              <w:t xml:space="preserve">256</w:t>
+            </w:r>
+          </w:p>
+        </w:tc>
+        <w:tc>
+          <w:tcPr>
+            <w:tcW w:type="dxa" w:w="2117"/>
+          </w:tcPr>
+          <w:p>
+            <w:pPr>
+              <w:keepNext w:val="0"/>
+              <w:keepLines/>
+            </w:pPr>
+            <w:r>
+              <w:rPr>
+                <w:rFonts w:ascii="Times New Roman" w:hAnsi="Times New Roman" w:eastAsia="Times New Roman"/>
+                <w:sz w:val="18"/>
+                <w:highlight w:val="yellow"/>
+              </w:rPr>
+              <w:t xml:space="preserve">SA 192.31 (7/7)</w:t>
+            </w:r>
+          </w:p>
+        </w:tc>
+        <w:tc>
+          <w:tcPr>
+            <w:tcW w:type="dxa" w:w="2117"/>
+          </w:tcPr>
+          <w:p>
+            <w:pPr>
+              <w:keepNext w:val="0"/>
+              <w:keepLines/>
+            </w:pPr>
+            <w:r>
+              <w:rPr>
+                <w:rFonts w:ascii="Times New Roman" w:hAnsi="Times New Roman" w:eastAsia="Times New Roman"/>
+                <w:sz w:val="18"/>
+                <w:highlight w:val="yellow"/>
+              </w:rPr>
+              <w:t xml:space="preserve">SA 180.24 (7/7)</w:t>
+            </w:r>
+          </w:p>
+        </w:tc>
+        <w:tc>
+          <w:tcPr>
+            <w:tcW w:type="dxa" w:w="893"/>
+          </w:tcPr>
+          <w:p>
+            <w:pPr>
+              <w:keepNext w:val="0"/>
+              <w:keepLines/>
+            </w:pPr>
+            <w:r>
+              <w:rPr>
+                <w:rFonts w:ascii="Times New Roman" w:hAnsi="Times New Roman" w:eastAsia="Times New Roman"/>
+                <w:sz w:val="18"/>
+                <w:highlight w:val="yellow"/>
+              </w:rPr>
+              <w:t xml:space="preserve">1.79</w:t>
+            </w:r>
+          </w:p>
+        </w:tc>
+        <w:tc>
+          <w:tcPr>
+            <w:tcW w:type="dxa" w:w="893"/>
+          </w:tcPr>
+          <w:p>
+            <w:pPr>
+              <w:keepNext w:val="0"/>
+              <w:keepLines/>
+            </w:pPr>
+            <w:r>
+              <w:rPr>
+                <w:rFonts w:ascii="Times New Roman" w:hAnsi="Times New Roman" w:eastAsia="Times New Roman"/>
+                <w:sz w:val="18"/>
+                <w:highlight w:val="yellow"/>
+              </w:rPr>
+              <w:t xml:space="preserve">1.67</w:t>
+            </w:r>
+          </w:p>
+        </w:tc>
+        <w:tc>
+          <w:tcPr>
+            <w:tcW w:type="dxa" w:w="893"/>
+          </w:tcPr>
+          <w:p>
+            <w:pPr>
+              <w:keepNext w:val="0"/>
+              <w:keepLines/>
+            </w:pPr>
+            <w:r>
+              <w:rPr>
+                <w:rFonts w:ascii="Times New Roman" w:hAnsi="Times New Roman" w:eastAsia="Times New Roman"/>
+                <w:sz w:val="18"/>
+                <w:highlight w:val="yellow"/>
+              </w:rPr>
+              <w:t xml:space="preserve">1.06</w:t>
+            </w:r>
+          </w:p>
+        </w:tc>
+      </w:tr>
+    </w:tbl>
+    <w:p>
+      <w:pPr>
+        <w:spacing w:line="240" w:lineRule="auto" w:before="0" w:after="40"/>
+      </w:pPr>
+      <w:r>
+        <w:rPr>
+          <w:sz w:val="4"/>
+        </w:rPr>
+        <w:t xml:space="preserve"> </w:t>
+      </w:r>
+    </w:p>
+    <w:p>
+      <w:pPr>
+        <w:pStyle w:val="IOP-CS-SubsectionHeading"/>
+        <w:keepNext/>
+        <w:keepLines/>
+      </w:pPr>
+      <w:r>
+        <w:rPr>
+          <w:rFonts w:ascii="Times New Roman" w:hAnsi="Times New Roman" w:eastAsia="Times New Roman"/>
+        </w:rPr>
+        <w:t xml:space="preserve">5.</w:t>
+      </w:r>
+      <w:r>
+        <w:rPr>
+          <w:rFonts w:ascii="Times New Roman" w:hAnsi="Times New Roman" w:eastAsia="Times New Roman"/>
+          <w:highlight w:val="yellow"/>
+        </w:rPr>
+        <w:t xml:space="preserve">4</w:t>
+      </w:r>
+      <w:r>
+        <w:rPr>
+          <w:rFonts w:ascii="Times New Roman" w:hAnsi="Times New Roman" w:eastAsia="Times New Roman"/>
+        </w:rPr>
+        <w:t xml:space="preserve">. Matched-Field and Forcing Audit</w:t>
       </w:r>
     </w:p>
     <w:p>
@@ -5227,7 +8023,20 @@
         <w:rPr>
           <w:rFonts w:ascii="Times New Roman" w:hAnsi="Times New Roman" w:eastAsia="Times New Roman"/>
         </w:rPr>
-        <w:t>Candidate-solver sensitivity. A separate 240-solve screen adds SA with symmetric-strength theta = 0.25 and classical Ruge-Stueben AMG with classical strength theta = 0.25. A subsequent 504-solve confirmation compares Jacobi, SA with theta = 0, and classical AMG at N = 128, 160, 192, using the two-island motif and the previously tested symmetric 3-by-6 anchor, whose three rows are each 110011. Each of seven repeats interleaves both field positions, both sources, both motifs, and all three methods at a fixed N. All 744 solves pass the same residual acceptance check; their timings are not pooled with earlier stages. The confirmation has 17 of 24 cells with the same winner in every repeat, and three of 12 translated pairs reverse their winner in all seven repeats. Table 6 reports all 12 pairs, including unstable cells and zero floors. For the original motif at N = 128 with odd-x forcing, centered Jacobi and classical AMG take 24.3 and 36.8 ms; after translation they take 42.3 and 34.2 ms. Jacobi iterations rise from 266 to 450, while classical AMG takes 11 in both positions. The three-method empirical excess-cost floor for this pair is 11.91%. At N = 192, classical AMG has the lowest median time at both positions, giving zero median-based floor for that pair, although the centered winner is not identical in all repeats. Thus translation sensitivity survives a stronger baseline, but its measured decision boundary and cost consequence depend on the candidate solver set.</w:t>
+        <w:t xml:space="preserve">Candidate-solver sensitivity. A separate 240-solve screen adds SA with symmetric-strength theta = 0.25 and classical Ruge-Stueben AMG with classical strength theta = 0.25. A subsequent 504-solve confirmation compares Jacobi, SA with theta = 0, and classical AMG at N = 128, 160, 192, using the two-island motif and the previously tested symmetric 3-by-6 anchor, whose three rows are each 110011. Each of seven repeats interleaves both field positions, both sources, both motifs, and all three methods at a fixed N. All 744 solves pass the same residual acceptance check; their timings are not pooled with earlier stages. The confirmation has 17 of 24 cells with the same winner in every repeat, and three of 12 translated pairs reverse their winner in all seven repeats. Table </w:t>
+      </w:r>
+      <w:r>
+        <w:rPr>
+          <w:rFonts w:ascii="Times New Roman" w:hAnsi="Times New Roman" w:eastAsia="Times New Roman"/>
+          <w:highlight w:val="yellow"/>
+        </w:rPr>
+        <w:t xml:space="preserve">8</w:t>
+      </w:r>
+      <w:r>
+        <w:rPr>
+          <w:rFonts w:ascii="Times New Roman" w:hAnsi="Times New Roman" w:eastAsia="Times New Roman"/>
+        </w:rPr>
+        <w:t xml:space="preserve"> reports all 12 pairs, including unstable cells and zero floors. For the original motif at N = 128 with odd-x forcing, centered Jacobi and classical AMG take 24.3 and 36.8 ms; after translation they take 42.3 and 34.2 ms. Jacobi iterations rise from 266 to 450, while classical AMG takes 11 in both positions. The three-method empirical excess-cost floor for this pair is 11.91%. At N = 192, classical AMG has the lowest median time at both positions, giving zero median-based floor for that pair, although the centered winner is not identical in all repeats. Thus translation sensitivity survives a stronger baseline, but its measured decision boundary and cost consequence depend on the candidate solver set.</w:t>
       </w:r>
     </w:p>
     <w:p>
@@ -5240,7 +8049,20 @@
         <w:rPr>
           <w:rFonts w:ascii="Times New Roman" w:hAnsi="Times New Roman" w:eastAsia="Times New Roman"/>
         </w:rPr>
-        <w:t>Table 6. All 12 translated pairs in the interleaved confirmation. Winners use median total time: J = Jacobi-PCG, RS = classical AMG-PCG; SA was also a candidate. Stable means both positions retain their respective winner in all seven repeats. E(P) uses measured medians even for unstable pairs; it is not a confidence bound.</w:t>
+        <w:t xml:space="preserve">Table </w:t>
+      </w:r>
+      <w:r>
+        <w:rPr>
+          <w:rFonts w:ascii="Times New Roman" w:hAnsi="Times New Roman" w:eastAsia="Times New Roman"/>
+          <w:highlight w:val="yellow"/>
+        </w:rPr>
+        <w:t xml:space="preserve">8</w:t>
+      </w:r>
+      <w:r>
+        <w:rPr>
+          <w:rFonts w:ascii="Times New Roman" w:hAnsi="Times New Roman" w:eastAsia="Times New Roman"/>
+        </w:rPr>
+        <w:t xml:space="preserve">. All 12 translated pairs in the interleaved confirmation. Winners use median total time: J = Jacobi-PCG, RS = classical AMG-PCG; SA was also a candidate. Stable means both positions retain their respective winner in all seven repeats. E(P) uses measured medians even for unstable pairs; it is not a confidence bound.</w:t>
       </w:r>
     </w:p>
     <w:tbl>
@@ -6990,7 +9812,20 @@
         <w:rPr>
           <w:rFonts w:ascii="Times New Roman" w:hAnsi="Times New Roman" w:eastAsia="Times New Roman"/>
         </w:rPr>
-        <w:t>5.4. CPU and CUDA Stencil Scaling</w:t>
+        <w:t xml:space="preserve">5.</w:t>
+      </w:r>
+      <w:r>
+        <w:rPr>
+          <w:rFonts w:ascii="Times New Roman" w:hAnsi="Times New Roman" w:eastAsia="Times New Roman"/>
+          <w:highlight w:val="yellow"/>
+        </w:rPr>
+        <w:t xml:space="preserve">5</w:t>
+      </w:r>
+      <w:r>
+        <w:rPr>
+          <w:rFonts w:ascii="Times New Roman" w:hAnsi="Times New Roman" w:eastAsia="Times New Roman"/>
+        </w:rPr>
+        <w:t xml:space="preserve">. CPU and CUDA Stencil Scaling</w:t>
       </w:r>
     </w:p>
     <w:p>
@@ -7025,7 +9860,20 @@
         <w:rPr>
           <w:rFonts w:ascii="Times New Roman" w:hAnsi="Times New Roman" w:eastAsia="Times New Roman"/>
         </w:rPr>
-        <w:t>Table 7. Representative stencil-throughput measurements. CPU entries use the variable-coefficient operator at N = 2048; CUDA entries are kernel-only Jacobi steps with arrays resident on the device.</w:t>
+        <w:t xml:space="preserve">Table </w:t>
+      </w:r>
+      <w:r>
+        <w:rPr>
+          <w:rFonts w:ascii="Times New Roman" w:hAnsi="Times New Roman" w:eastAsia="Times New Roman"/>
+          <w:highlight w:val="yellow"/>
+        </w:rPr>
+        <w:t xml:space="preserve">9</w:t>
+      </w:r>
+      <w:r>
+        <w:rPr>
+          <w:rFonts w:ascii="Times New Roman" w:hAnsi="Times New Roman" w:eastAsia="Times New Roman"/>
+        </w:rPr>
+        <w:t xml:space="preserve">. Representative stencil-throughput measurements. CPU entries use the variable-coefficient operator at N = 2048; CUDA entries are kernel-only Jacobi steps with arrays resident on the device.</w:t>
       </w:r>
     </w:p>
     <w:tbl>
@@ -7776,6 +10624,18 @@
       <w:r>
         <w:rPr>
           <w:rFonts w:ascii="Times New Roman" w:hAnsi="Times New Roman" w:eastAsia="Times New Roman"/>
+          <w:highlight w:val="yellow"/>
+        </w:rPr>
+        <w:t xml:space="preserve">For physical composite-conduction use, the face law must be chosen from the interface geometry and resistance model before comparing solvers. The arithmetic benchmark is not evidence of accurate cross-interface flux at high contrast. For performance use, the callback calibration shows that an iteration monitor can disproportionately penalise inexpensive iterations; solver rankings and their uncertainty must therefore be reported with the callback, setup and execution protocol.</w:t>
+      </w:r>
+    </w:p>
+    <w:p>
+      <w:pPr>
+        <w:pStyle w:val="IOP-CS-BodyText"/>
+      </w:pPr>
+      <w:r>
+        <w:rPr>
+          <w:rFonts w:ascii="Times New Roman" w:hAnsi="Times New Roman" w:eastAsia="Times New Roman"/>
         </w:rPr>
         <w:t>The coefficient descriptors are empirical summaries, not conditioning theory. Their uncertainty intervals overlap, and small fixed-grid strata do not establish a reliable ordering of predictive importance. Pooled correlations also reflect resolution; N = 256 uses an N = 128 condition estimate. Case-resampling intervals describe sensitivity to this constructed dataset, not population confidence or performance on unseen geometries.</w:t>
       </w:r>
@@ -7823,7 +10683,228 @@
         <w:rPr>
           <w:rFonts w:ascii="Times New Roman" w:hAnsi="Times New Roman" w:eastAsia="Times New Roman"/>
         </w:rPr>
-        <w:t>The supplementary artefact is archived at https://doi.org/10.5281/zenodo.22668106 and contains scripts, raw CSV files, generated outputs, metadata, and tests. Baseline measurements remain available at https://doi.org/10.5281/zenodo.22303525; the matched-field, forcing, perturbation, and portfolio measurements are included in the new archive under results/raw/counterfactual. The reproduction instructions distinguish historical monitored runs from the controlled count-only timing protocol and preserve pilot failures. Tests check flux-energy identities, equality of scalar descriptors, reflection invariance, and transpose equivalence in addition to the original numerical verification. CPU-only tests explicitly skip unavailable CUDA tests; a CUDA-required mode treats missing GPU support as an error. Timing reruns may differ with machine state. Recorded configurations document the measured runs, and the supplied CSV files regenerate the reported tables and figures.</w:t>
+        <w:t xml:space="preserve">The</w:t>
+      </w:r>
+      <w:r>
+        <w:rPr>
+          <w:rFonts w:ascii="Times New Roman" w:hAnsi="Times New Roman" w:eastAsia="Times New Roman"/>
+          <w:highlight w:val="yellow"/>
+        </w:rPr>
+        <w:t xml:space="preserve"> previously published baseline and controlled extension are archived at https://doi.org/10.5281/zenodo.22668106, with the earlier baseline at https://doi.org/10.5281/zenodo.22303525. The present revision additionally supplies the callback calibration in results/raw/protocol_sensitivity, its prospective protocol in experiments/protocol_sensitivity.md, and complete generated summaries in results/analysis/protocol_sensitivity through the accompanying</w:t>
+      </w:r>
+      <w:r>
+        <w:rPr>
+          <w:rFonts w:ascii="Times New Roman" w:hAnsi="Times New Roman" w:eastAsia="Times New Roman"/>
+        </w:rPr>
+        <w:t xml:space="preserve"> supplementary </w:t>
+      </w:r>
+      <w:r>
+        <w:rPr>
+          <w:rFonts w:ascii="Times New Roman" w:hAnsi="Times New Roman" w:eastAsia="Times New Roman"/>
+          <w:highlight w:val="yellow"/>
+        </w:rPr>
+        <w:t xml:space="preserve">package. The complete revised </w:t>
+      </w:r>
+      <w:r>
+        <w:rPr>
+          <w:rFonts w:ascii="Times New Roman" w:hAnsi="Times New Roman" w:eastAsia="Times New Roman"/>
+        </w:rPr>
+        <w:t xml:space="preserve">artefact</w:t>
+      </w:r>
+      <w:r>
+        <w:rPr>
+          <w:rFonts w:ascii="Times New Roman" w:hAnsi="Times New Roman" w:eastAsia="Times New Roman"/>
+          <w:highlight w:val="yellow"/>
+        </w:rPr>
+        <w:t xml:space="preserve">, including these calibration files,</w:t>
+      </w:r>
+      <w:r>
+        <w:rPr>
+          <w:rFonts w:ascii="Times New Roman" w:hAnsi="Times New Roman" w:eastAsia="Times New Roman"/>
+        </w:rPr>
+        <w:t xml:space="preserve"> is archived at https://doi.org/10.5281/zenodo.</w:t>
+      </w:r>
+      <w:r>
+        <w:rPr>
+          <w:rFonts w:ascii="Times New Roman" w:hAnsi="Times New Roman" w:eastAsia="Times New Roman"/>
+          <w:highlight w:val="yellow"/>
+        </w:rPr>
+        <w:t xml:space="preserve">22874266</w:t>
+      </w:r>
+      <w:r>
+        <w:rPr>
+          <w:rFonts w:ascii="Times New Roman" w:hAnsi="Times New Roman" w:eastAsia="Times New Roman"/>
+        </w:rPr>
+        <w:t xml:space="preserve"> </w:t>
+      </w:r>
+      <w:r>
+        <w:rPr>
+          <w:rFonts w:ascii="Times New Roman" w:hAnsi="Times New Roman" w:eastAsia="Times New Roman"/>
+          <w:highlight w:val="yellow"/>
+        </w:rPr>
+        <w:t xml:space="preserve">(version</w:t>
+      </w:r>
+      <w:r>
+        <w:rPr>
+          <w:rFonts w:ascii="Times New Roman" w:hAnsi="Times New Roman" w:eastAsia="Times New Roman"/>
+        </w:rPr>
+        <w:t xml:space="preserve"> </w:t>
+      </w:r>
+      <w:r>
+        <w:rPr>
+          <w:rFonts w:ascii="Times New Roman" w:hAnsi="Times New Roman" w:eastAsia="Times New Roman"/>
+          <w:highlight w:val="yellow"/>
+        </w:rPr>
+        <w:t xml:space="preserve">v5).</w:t>
+      </w:r>
+      <w:r>
+        <w:rPr>
+          <w:rFonts w:ascii="Times New Roman" w:hAnsi="Times New Roman" w:eastAsia="Times New Roman"/>
+        </w:rPr>
+        <w:t xml:space="preserve"> </w:t>
+      </w:r>
+      <w:r>
+        <w:rPr>
+          <w:rFonts w:ascii="Times New Roman" w:hAnsi="Times New Roman" w:eastAsia="Times New Roman"/>
+          <w:highlight w:val="yellow"/>
+        </w:rPr>
+        <w:t xml:space="preserve">Raw</w:t>
+      </w:r>
+      <w:r>
+        <w:rPr>
+          <w:rFonts w:ascii="Times New Roman" w:hAnsi="Times New Roman" w:eastAsia="Times New Roman"/>
+        </w:rPr>
+        <w:t xml:space="preserve"> </w:t>
+      </w:r>
+      <w:r>
+        <w:rPr>
+          <w:rFonts w:ascii="Times New Roman" w:hAnsi="Times New Roman" w:eastAsia="Times New Roman"/>
+          <w:highlight w:val="yellow"/>
+        </w:rPr>
+        <w:t xml:space="preserve">histories are retained unchanged. Run experiments/analyze_protocol_sensitivity.py to regenerate the two new tables from the recorded</w:t>
+      </w:r>
+      <w:r>
+        <w:rPr>
+          <w:rFonts w:ascii="Times New Roman" w:hAnsi="Times New Roman" w:eastAsia="Times New Roman"/>
+        </w:rPr>
+        <w:t xml:space="preserve"> CSV files</w:t>
+      </w:r>
+      <w:r>
+        <w:rPr>
+          <w:rFonts w:ascii="Times New Roman" w:hAnsi="Times New Roman" w:eastAsia="Times New Roman"/>
+          <w:highlight w:val="yellow"/>
+        </w:rPr>
+        <w:t xml:space="preserve">.</w:t>
+      </w:r>
+      <w:r>
+        <w:rPr>
+          <w:rFonts w:ascii="Times New Roman" w:hAnsi="Times New Roman" w:eastAsia="Times New Roman"/>
+        </w:rPr>
+        <w:t xml:space="preserve"> </w:t>
+      </w:r>
+      <w:r>
+        <w:rPr>
+          <w:rFonts w:ascii="Times New Roman" w:hAnsi="Times New Roman" w:eastAsia="Times New Roman"/>
+          <w:highlight w:val="yellow"/>
+        </w:rPr>
+        <w:t xml:space="preserve">Recorded</w:t>
+      </w:r>
+      <w:r>
+        <w:rPr>
+          <w:rFonts w:ascii="Times New Roman" w:hAnsi="Times New Roman" w:eastAsia="Times New Roman"/>
+        </w:rPr>
+        <w:t xml:space="preserve"> </w:t>
+      </w:r>
+      <w:r>
+        <w:rPr>
+          <w:rFonts w:ascii="Times New Roman" w:hAnsi="Times New Roman" w:eastAsia="Times New Roman"/>
+          <w:highlight w:val="yellow"/>
+        </w:rPr>
+        <w:t xml:space="preserve">configurations</w:t>
+      </w:r>
+      <w:r>
+        <w:rPr>
+          <w:rFonts w:ascii="Times New Roman" w:hAnsi="Times New Roman" w:eastAsia="Times New Roman"/>
+        </w:rPr>
+        <w:t xml:space="preserve"> and </w:t>
+      </w:r>
+      <w:r>
+        <w:rPr>
+          <w:rFonts w:ascii="Times New Roman" w:hAnsi="Times New Roman" w:eastAsia="Times New Roman"/>
+          <w:highlight w:val="yellow"/>
+        </w:rPr>
+        <w:t xml:space="preserve">source</w:t>
+      </w:r>
+      <w:r>
+        <w:rPr>
+          <w:rFonts w:ascii="Times New Roman" w:hAnsi="Times New Roman" w:eastAsia="Times New Roman"/>
+        </w:rPr>
+        <w:t xml:space="preserve"> </w:t>
+      </w:r>
+      <w:r>
+        <w:rPr>
+          <w:rFonts w:ascii="Times New Roman" w:hAnsi="Times New Roman" w:eastAsia="Times New Roman"/>
+          <w:highlight w:val="yellow"/>
+        </w:rPr>
+        <w:t xml:space="preserve">hashes</w:t>
+      </w:r>
+      <w:r>
+        <w:rPr>
+          <w:rFonts w:ascii="Times New Roman" w:hAnsi="Times New Roman" w:eastAsia="Times New Roman"/>
+        </w:rPr>
+        <w:t xml:space="preserve"> </w:t>
+      </w:r>
+      <w:r>
+        <w:rPr>
+          <w:rFonts w:ascii="Times New Roman" w:hAnsi="Times New Roman" w:eastAsia="Times New Roman"/>
+          <w:highlight w:val="yellow"/>
+        </w:rPr>
+        <w:t xml:space="preserve">document</w:t>
+      </w:r>
+      <w:r>
+        <w:rPr>
+          <w:rFonts w:ascii="Times New Roman" w:hAnsi="Times New Roman" w:eastAsia="Times New Roman"/>
+        </w:rPr>
+        <w:t xml:space="preserve"> the </w:t>
+      </w:r>
+      <w:r>
+        <w:rPr>
+          <w:rFonts w:ascii="Times New Roman" w:hAnsi="Times New Roman" w:eastAsia="Times New Roman"/>
+          <w:highlight w:val="yellow"/>
+        </w:rPr>
+        <w:t xml:space="preserve">calibration</w:t>
+      </w:r>
+      <w:r>
+        <w:rPr>
+          <w:rFonts w:ascii="Times New Roman" w:hAnsi="Times New Roman" w:eastAsia="Times New Roman"/>
+        </w:rPr>
+        <w:t xml:space="preserve">. The reproduction instructions distinguish historical monitored runs from controlled count-only </w:t>
+      </w:r>
+      <w:r>
+        <w:rPr>
+          <w:rFonts w:ascii="Times New Roman" w:hAnsi="Times New Roman" w:eastAsia="Times New Roman"/>
+          <w:highlight w:val="yellow"/>
+        </w:rPr>
+        <w:t xml:space="preserve">runs</w:t>
+      </w:r>
+      <w:r>
+        <w:rPr>
+          <w:rFonts w:ascii="Times New Roman" w:hAnsi="Times New Roman" w:eastAsia="Times New Roman"/>
+        </w:rPr>
+        <w:t xml:space="preserve"> and preserve pilot failures. Tests check flux-energy identities, </w:t>
+      </w:r>
+      <w:r>
+        <w:rPr>
+          <w:rFonts w:ascii="Times New Roman" w:hAnsi="Times New Roman" w:eastAsia="Times New Roman"/>
+          <w:highlight w:val="yellow"/>
+        </w:rPr>
+        <w:t xml:space="preserve">matched</w:t>
+      </w:r>
+      <w:r>
+        <w:rPr>
+          <w:rFonts w:ascii="Times New Roman" w:hAnsi="Times New Roman" w:eastAsia="Times New Roman"/>
+        </w:rPr>
+        <w:t xml:space="preserve"> descriptors, reflection invariance and transpose equivalence. CPU-only tests explicitly skip unavailable CUDA tests; CUDA-required mode treats missing GPU support as an error. Timing reruns may differ with machine state.</w:t>
       </w:r>
     </w:p>
     <w:p>
@@ -8210,6 +11291,34 @@
           <w:sz w:val="18"/>
         </w:rPr>
         <w:t>[25] Ewald R 2011 Automatic Algorithm Selection for Complex Simulation Problems PhD thesis University of Rostock. urn:nbn:de:gbv:28-diss2011-0162-1</w:t>
+      </w:r>
+    </w:p>
+    <w:p>
+      <w:pPr>
+        <w:pStyle w:val="IOP-CS-ReferenceText"/>
+        <w:spacing w:line="240" w:lineRule="auto" w:before="0" w:after="0"/>
+      </w:pPr>
+      <w:r>
+        <w:rPr>
+          <w:rFonts w:ascii="Times New Roman" w:hAnsi="Times New Roman" w:eastAsia="Times New Roman"/>
+          <w:sz w:val="18"/>
+          <w:highlight w:val="yellow"/>
+        </w:rPr>
+        <w:t xml:space="preserve">[26] Patankar S V 1980 Numerical Heat Transfer and Fluid Flow 1st edn (New York: Hemisphere). ISBN:9780891165224</w:t>
+      </w:r>
+    </w:p>
+    <w:p>
+      <w:pPr>
+        <w:pStyle w:val="IOP-CS-ReferenceText"/>
+        <w:spacing w:line="240" w:lineRule="auto" w:before="0" w:after="0"/>
+      </w:pPr>
+      <w:r>
+        <w:rPr>
+          <w:rFonts w:ascii="Times New Roman" w:hAnsi="Times New Roman" w:eastAsia="Times New Roman"/>
+          <w:sz w:val="18"/>
+          <w:highlight w:val="yellow"/>
+        </w:rPr>
+        <w:t xml:space="preserve">[27] Hoefler T and Belli R 2015 Scientific benchmarking of parallel computing systems: twelve ways to tell the masses when reporting performance results Proc. International Conference for High Performance Computing, Networking, Storage and Analysis (SC15) 73:1-73:12. doi:10.1145/2807591.2807644</w:t>
       </w:r>
     </w:p>
     <w:sectPr>

</xml_diff>